<commit_message>
Diario de reflexión Yasna Villarroel
</commit_message>
<xml_diff>
--- a/Fase 1/Evidencias Individuales/Villarroel_Yasna_1.2_APT122_DiarioReflexionFase1.docx
+++ b/Fase 1/Evidencias Individuales/Villarroel_Yasna_1.2_APT122_DiarioReflexionFase1.docx
@@ -70,12 +70,12 @@
                 <wp:inline distB="0" distT="0" distL="0" distR="0">
                   <wp:extent cx="393640" cy="444500"/>
                   <wp:effectExtent b="0" l="0" r="0" t="0"/>
-                  <wp:docPr id="17580" name="image2.png"/>
+                  <wp:docPr id="17580" name="image1.png"/>
                   <a:graphic>
                     <a:graphicData uri="http://schemas.openxmlformats.org/drawingml/2006/picture">
                       <pic:pic>
                         <pic:nvPicPr>
-                          <pic:cNvPr id="0" name="image2.png"/>
+                          <pic:cNvPr id="0" name="image1.png"/>
                           <pic:cNvPicPr preferRelativeResize="0"/>
                         </pic:nvPicPr>
                         <pic:blipFill>
@@ -219,7 +219,7 @@
           </w:tcPr>
           <w:p>
             <w:pPr>
-              <w:spacing w:after="0" w:line="240" w:lineRule="auto"/>
+              <w:spacing w:after="200" w:before="200" w:line="240" w:lineRule="auto"/>
               <w:rPr>
                 <w:color w:val="767171"/>
                 <w:sz w:val="24"/>
@@ -250,25 +250,8 @@
         <w:rPr>
           <w:b w:val="1"/>
           <w:bCs w:val="1"/>
-          <w:sz w:val="24"/>
-          <w:szCs w:val="24"/>
-        </w:rPr>
-      </w:pPr>
-      <w:r>
-        <w:rPr>
-          <w:rtl w:val="0"/>
-        </w:rPr>
-      </w:r>
-    </w:p>
-    <w:p>
-      <w:pPr>
-        <w:spacing w:after="0" w:line="360" w:lineRule="auto"/>
-        <w:jc w:val="both"/>
-        <w:rPr>
-          <w:b w:val="1"/>
-          <w:bCs w:val="1"/>
-          <w:sz w:val="24"/>
-          <w:szCs w:val="24"/>
+          <w:sz w:val="14"/>
+          <w:szCs w:val="14"/>
         </w:rPr>
       </w:pPr>
       <w:r>
@@ -313,6 +296,7 @@
           </w:tcPr>
           <w:p>
             <w:pPr>
+              <w:spacing w:after="200" w:before="200" w:lineRule="auto"/>
               <w:rPr>
                 <w:b w:val="1"/>
                 <w:bCs w:val="1"/>
@@ -350,6 +334,7 @@
           </w:tcPr>
           <w:p>
             <w:pPr>
+              <w:spacing w:after="200" w:lineRule="auto"/>
               <w:rPr>
                 <w:color w:val="767171"/>
                 <w:sz w:val="24"/>
@@ -358,188 +343,12 @@
             </w:pPr>
             <w:r>
               <w:rPr>
-                <w:rtl w:val="0"/>
-              </w:rPr>
-            </w:r>
-          </w:p>
-          <w:p>
-            <w:pPr>
-              <w:rPr>
-                <w:color w:val="767171"/>
-                <w:sz w:val="24"/>
-                <w:szCs w:val="24"/>
-              </w:rPr>
-            </w:pPr>
-            <w:r>
-              <w:rPr>
                 <w:sz w:val="24"/>
                 <w:szCs w:val="24"/>
                 <w:rtl w:val="0"/>
               </w:rPr>
               <w:t xml:space="preserve">¿Cuáles son las asignaturas o certificados que más te gustaron y/o se relacionan con tus intereses profesionales? ¿Qué es lo que más te gustó de cada uno? </w:t>
             </w:r>
-            <w:r>
-              <w:rPr>
-                <w:rtl w:val="0"/>
-              </w:rPr>
-            </w:r>
-          </w:p>
-          <w:p>
-            <w:pPr>
-              <w:rPr>
-                <w:color w:val="767171"/>
-                <w:sz w:val="24"/>
-                <w:szCs w:val="24"/>
-              </w:rPr>
-            </w:pPr>
-            <w:r>
-              <w:rPr>
-                <w:rtl w:val="0"/>
-              </w:rPr>
-            </w:r>
-          </w:p>
-          <w:p>
-            <w:pPr>
-              <w:rPr>
-                <w:color w:val="767171"/>
-                <w:sz w:val="24"/>
-                <w:szCs w:val="24"/>
-              </w:rPr>
-            </w:pPr>
-            <w:r>
-              <w:rPr>
-                <w:rtl w:val="0"/>
-              </w:rPr>
-            </w:r>
-          </w:p>
-          <w:p>
-            <w:pPr>
-              <w:rPr>
-                <w:color w:val="767171"/>
-                <w:sz w:val="24"/>
-                <w:szCs w:val="24"/>
-              </w:rPr>
-            </w:pPr>
-            <w:r>
-              <w:rPr>
-                <w:rtl w:val="0"/>
-              </w:rPr>
-            </w:r>
-          </w:p>
-          <w:p>
-            <w:pPr>
-              <w:rPr>
-                <w:color w:val="767171"/>
-                <w:sz w:val="24"/>
-                <w:szCs w:val="24"/>
-              </w:rPr>
-            </w:pPr>
-            <w:r>
-              <w:rPr>
-                <w:rtl w:val="0"/>
-              </w:rPr>
-            </w:r>
-          </w:p>
-          <w:p>
-            <w:pPr>
-              <w:rPr>
-                <w:color w:val="767171"/>
-                <w:sz w:val="24"/>
-                <w:szCs w:val="24"/>
-              </w:rPr>
-            </w:pPr>
-            <w:r>
-              <w:rPr>
-                <w:sz w:val="24"/>
-                <w:szCs w:val="24"/>
-                <w:rtl w:val="0"/>
-              </w:rPr>
-              <w:t xml:space="preserve">A partir de las certificaciones que obtienes a lo largo de la carrera ¿Existe valor en la o las certificaciones obtenidas? ¿Por qué?</w:t>
-            </w:r>
-            <w:r>
-              <w:rPr>
-                <w:rtl w:val="0"/>
-              </w:rPr>
-            </w:r>
-          </w:p>
-          <w:p>
-            <w:pPr>
-              <w:rPr>
-                <w:color w:val="767171"/>
-                <w:sz w:val="24"/>
-                <w:szCs w:val="24"/>
-              </w:rPr>
-            </w:pPr>
-            <w:r>
-              <w:rPr>
-                <w:rtl w:val="0"/>
-              </w:rPr>
-            </w:r>
-          </w:p>
-          <w:p>
-            <w:pPr>
-              <w:rPr>
-                <w:color w:val="767171"/>
-                <w:sz w:val="24"/>
-                <w:szCs w:val="24"/>
-              </w:rPr>
-            </w:pPr>
-            <w:r>
-              <w:rPr>
-                <w:rtl w:val="0"/>
-              </w:rPr>
-            </w:r>
-          </w:p>
-          <w:p>
-            <w:pPr>
-              <w:rPr>
-                <w:color w:val="767171"/>
-                <w:sz w:val="24"/>
-                <w:szCs w:val="24"/>
-              </w:rPr>
-            </w:pPr>
-            <w:r>
-              <w:rPr>
-                <w:rtl w:val="0"/>
-              </w:rPr>
-            </w:r>
-          </w:p>
-          <w:p>
-            <w:pPr>
-              <w:rPr>
-                <w:color w:val="767171"/>
-                <w:sz w:val="24"/>
-                <w:szCs w:val="24"/>
-              </w:rPr>
-            </w:pPr>
-            <w:r>
-              <w:rPr>
-                <w:rtl w:val="0"/>
-              </w:rPr>
-            </w:r>
-          </w:p>
-          <w:p>
-            <w:pPr>
-              <w:rPr>
-                <w:color w:val="767171"/>
-                <w:sz w:val="24"/>
-                <w:szCs w:val="24"/>
-              </w:rPr>
-            </w:pPr>
-            <w:r>
-              <w:rPr>
-                <w:rtl w:val="0"/>
-              </w:rPr>
-            </w:r>
-          </w:p>
-          <w:p>
-            <w:pPr>
-              <w:rPr>
-                <w:color w:val="767171"/>
-                <w:sz w:val="24"/>
-                <w:szCs w:val="24"/>
-              </w:rPr>
-            </w:pPr>
             <w:r>
               <w:rPr>
                 <w:rtl w:val="0"/>
@@ -550,6 +359,67 @@
             <w:pPr>
               <w:jc w:val="both"/>
               <w:rPr>
+                <w:color w:val="434343"/>
+                <w:sz w:val="24"/>
+                <w:szCs w:val="24"/>
+              </w:rPr>
+            </w:pPr>
+            <w:r>
+              <w:rPr>
+                <w:color w:val="434343"/>
+                <w:sz w:val="24"/>
+                <w:szCs w:val="24"/>
+                <w:rtl w:val="0"/>
+              </w:rPr>
+              <w:t xml:space="preserve">Las asignaturas y certificados que más me han gustado son los relacionados con Programación de Software, Análisis y Planificación de Requerimientos y Gestión de Proyectos Informáticos. En programación, lo que más me gustó fue poder desarrollar soluciones y llevar una idea a algo funcional, usando distintas herramientas y lenguajes. En el área de requerimientos, me interesó aprender a identificar las necesidades de los usuarios y transformarlas en funcionalidades para un sistema. Por último, en Gestión de Proyectos me gustó aprender a planificar, organizar tareas, trabajar con metodologías ágiles y realizar seguimiento del avance de un proyecto.</w:t>
+            </w:r>
+          </w:p>
+          <w:p>
+            <w:pPr>
+              <w:spacing w:after="240" w:before="240" w:lineRule="auto"/>
+              <w:jc w:val="both"/>
+              <w:rPr>
+                <w:color w:val="767171"/>
+                <w:sz w:val="24"/>
+                <w:szCs w:val="24"/>
+              </w:rPr>
+            </w:pPr>
+            <w:r>
+              <w:rPr>
+                <w:color w:val="434343"/>
+                <w:sz w:val="24"/>
+                <w:szCs w:val="24"/>
+                <w:rtl w:val="0"/>
+              </w:rPr>
+              <w:t xml:space="preserve">También me han parecido interesantes asignaturas como Bases de Datos, Minería de Datos y Big Data, porque se puede trabajar con información, analizarla y utilizarla para apoyar la toma de decisiones. Considero que estas áreas se relacionan con mis intereses profesionales porque combinan el desarrollo de software con el análisis y la gestión de información, sólo que me faltaría ejercitarlas más.</w:t>
+            </w:r>
+            <w:r>
+              <w:rPr>
+                <w:rtl w:val="0"/>
+              </w:rPr>
+            </w:r>
+          </w:p>
+          <w:p>
+            <w:pPr>
+              <w:spacing w:after="200" w:lineRule="auto"/>
+              <w:rPr>
+                <w:sz w:val="24"/>
+                <w:szCs w:val="24"/>
+              </w:rPr>
+            </w:pPr>
+            <w:r>
+              <w:rPr>
+                <w:sz w:val="24"/>
+                <w:szCs w:val="24"/>
+                <w:rtl w:val="0"/>
+              </w:rPr>
+              <w:t xml:space="preserve">A partir de las certificaciones que obtienes a lo largo de la carrera ¿Existe valor en la o las certificaciones obtenidas? ¿Por qué?</w:t>
+            </w:r>
+          </w:p>
+          <w:p>
+            <w:pPr>
+              <w:jc w:val="both"/>
+              <w:rPr>
                 <w:rFonts w:ascii="Calibri" w:cs="Calibri" w:eastAsia="Calibri" w:hAnsi="Calibri"/>
                 <w:b w:val="1"/>
                 <w:bCs w:val="1"/>
@@ -558,6 +428,15 @@
             </w:pPr>
             <w:r>
               <w:rPr>
+                <w:color w:val="434343"/>
+                <w:sz w:val="24"/>
+                <w:szCs w:val="24"/>
+                <w:rtl w:val="0"/>
+              </w:rPr>
+              <w:t xml:space="preserve">Respecto a las certificaciones obtenidas durante la carrera, considero que sí tienen valor, ya que permiten demostrar las competencias que se han ido adquiriendo en distintas áreas y no solamente al finalizar la carrera. Además, sirven como respaldo de los conocimientos desarrollados y pueden complementar el título profesional al momento de buscar una práctica o una oportunidad laboral. </w:t>
+            </w:r>
+            <w:r>
+              <w:rPr>
                 <w:rtl w:val="0"/>
               </w:rPr>
             </w:r>
@@ -578,8 +457,443 @@
               </w:rPr>
             </w:r>
           </w:p>
+        </w:tc>
+      </w:tr>
+    </w:tbl>
+    <w:p>
+      <w:pPr>
+        <w:spacing w:after="0" w:line="360" w:lineRule="auto"/>
+        <w:jc w:val="both"/>
+        <w:rPr>
+          <w:b w:val="1"/>
+          <w:bCs w:val="1"/>
+          <w:sz w:val="24"/>
+          <w:szCs w:val="24"/>
+        </w:rPr>
+      </w:pPr>
+      <w:r>
+        <w:rPr>
+          <w:rtl w:val="0"/>
+        </w:rPr>
+      </w:r>
+    </w:p>
+    <w:tbl>
+      <w:tblPr>
+        <w:tblStyle w:val="Table4"/>
+        <w:tblW w:w="10076.0" w:type="dxa"/>
+        <w:jc w:val="left"/>
+        <w:tblBorders>
+          <w:top w:color="bfbfbf" w:space="0" w:sz="4" w:val="single"/>
+          <w:left w:color="bfbfbf" w:space="0" w:sz="4" w:val="single"/>
+          <w:bottom w:color="bfbfbf" w:space="0" w:sz="4" w:val="single"/>
+          <w:right w:color="bfbfbf" w:space="0" w:sz="4" w:val="single"/>
+          <w:insideH w:color="bfbfbf" w:space="0" w:sz="4" w:val="single"/>
+          <w:insideV w:color="bfbfbf" w:space="0" w:sz="4" w:val="single"/>
+        </w:tblBorders>
+        <w:tblLayout w:type="fixed"/>
+        <w:tblLook w:val="0400"/>
+      </w:tblPr>
+      <w:tblGrid>
+        <w:gridCol w:w="10076"/>
+        <w:tblGridChange w:id="0">
+          <w:tblGrid>
+            <w:gridCol w:w="10076"/>
+          </w:tblGrid>
+        </w:tblGridChange>
+      </w:tblGrid>
+      <w:tr>
+        <w:trPr>
+          <w:cantSplit w:val="0"/>
+          <w:trHeight w:val="440" w:hRule="atLeast"/>
+          <w:tblHeader w:val="0"/>
+        </w:trPr>
+        <w:tc>
+          <w:tcPr>
+            <w:vAlign w:val="center"/>
+          </w:tcPr>
           <w:p>
             <w:pPr>
+              <w:spacing w:after="200" w:before="200" w:lineRule="auto"/>
+              <w:jc w:val="both"/>
+              <w:rPr>
+                <w:color w:val="767171"/>
+                <w:sz w:val="24"/>
+                <w:szCs w:val="24"/>
+              </w:rPr>
+            </w:pPr>
+            <w:r>
+              <w:rPr>
+                <w:sz w:val="24"/>
+                <w:szCs w:val="24"/>
+                <w:rtl w:val="0"/>
+              </w:rPr>
+              <w:t xml:space="preserve">2. Revisa las competencias y unidades de competencias correspondientes a cada asignatura de la malla de tu carrera. Marca en </w:t>
+            </w:r>
+            <w:r>
+              <w:rPr>
+                <w:b w:val="1"/>
+                <w:bCs w:val="1"/>
+                <w:color w:val="385623"/>
+                <w:sz w:val="24"/>
+                <w:szCs w:val="24"/>
+                <w:rtl w:val="0"/>
+              </w:rPr>
+              <w:t xml:space="preserve">verde</w:t>
+            </w:r>
+            <w:r>
+              <w:rPr>
+                <w:color w:val="385623"/>
+                <w:sz w:val="24"/>
+                <w:szCs w:val="24"/>
+                <w:rtl w:val="0"/>
+              </w:rPr>
+              <w:t xml:space="preserve"> </w:t>
+            </w:r>
+            <w:r>
+              <w:rPr>
+                <w:sz w:val="24"/>
+                <w:szCs w:val="24"/>
+                <w:rtl w:val="0"/>
+              </w:rPr>
+              <w:t xml:space="preserve">las competencias o unidades de competencia que consideras son tus </w:t>
+            </w:r>
+            <w:r>
+              <w:rPr>
+                <w:b w:val="1"/>
+                <w:bCs w:val="1"/>
+                <w:color w:val="385623"/>
+                <w:sz w:val="24"/>
+                <w:szCs w:val="24"/>
+                <w:rtl w:val="0"/>
+              </w:rPr>
+              <w:t xml:space="preserve">fortalezas</w:t>
+            </w:r>
+            <w:r>
+              <w:rPr>
+                <w:color w:val="385623"/>
+                <w:sz w:val="24"/>
+                <w:szCs w:val="24"/>
+                <w:rtl w:val="0"/>
+              </w:rPr>
+              <w:t xml:space="preserve"> </w:t>
+            </w:r>
+            <w:r>
+              <w:rPr>
+                <w:sz w:val="24"/>
+                <w:szCs w:val="24"/>
+                <w:rtl w:val="0"/>
+              </w:rPr>
+              <w:t xml:space="preserve">y en </w:t>
+            </w:r>
+            <w:r>
+              <w:rPr>
+                <w:b w:val="1"/>
+                <w:bCs w:val="1"/>
+                <w:color w:val="ff0000"/>
+                <w:sz w:val="24"/>
+                <w:szCs w:val="24"/>
+                <w:rtl w:val="0"/>
+              </w:rPr>
+              <w:t xml:space="preserve">rojo</w:t>
+            </w:r>
+            <w:r>
+              <w:rPr>
+                <w:sz w:val="24"/>
+                <w:szCs w:val="24"/>
+                <w:rtl w:val="0"/>
+              </w:rPr>
+              <w:t xml:space="preserve"> las que requieren ser fortalecidas. A partir de este ejercicio responde:</w:t>
+            </w:r>
+            <w:r>
+              <w:rPr>
+                <w:rtl w:val="0"/>
+              </w:rPr>
+            </w:r>
+          </w:p>
+        </w:tc>
+      </w:tr>
+      <w:tr>
+        <w:trPr>
+          <w:cantSplit w:val="0"/>
+          <w:trHeight w:val="440" w:hRule="atLeast"/>
+          <w:tblHeader w:val="0"/>
+        </w:trPr>
+        <w:tc>
+          <w:tcPr>
+            <w:shd w:fill="deeaf6" w:val="clear"/>
+            <w:vAlign w:val="center"/>
+          </w:tcPr>
+          <w:p>
+            <w:pPr>
+              <w:jc w:val="both"/>
+              <w:rPr>
+                <w:color w:val="767171"/>
+                <w:sz w:val="24"/>
+                <w:szCs w:val="24"/>
+              </w:rPr>
+            </w:pPr>
+            <w:r>
+              <w:rPr>
+                <w:rtl w:val="0"/>
+              </w:rPr>
+            </w:r>
+          </w:p>
+          <w:p>
+            <w:pPr>
+              <w:keepNext w:val="0"/>
+              <w:keepLines w:val="0"/>
+              <w:pageBreakBefore w:val="0"/>
+              <w:widowControl w:val="1"/>
+              <w:numPr>
+                <w:ilvl w:val="0"/>
+                <w:numId w:val="1"/>
+              </w:numPr>
+              <w:pBdr>
+                <w:top w:space="0" w:sz="0" w:val="nil"/>
+                <w:left w:space="0" w:sz="0" w:val="nil"/>
+                <w:bottom w:space="0" w:sz="0" w:val="nil"/>
+                <w:right w:space="0" w:sz="0" w:val="nil"/>
+                <w:between w:space="0" w:sz="0" w:val="nil"/>
+              </w:pBdr>
+              <w:shd w:fill="auto" w:val="clear"/>
+              <w:tabs>
+                <w:tab w:val="left" w:leader="none" w:pos="454"/>
+              </w:tabs>
+              <w:spacing w:after="160" w:before="0" w:line="259" w:lineRule="auto"/>
+              <w:ind w:left="454" w:right="0" w:hanging="283"/>
+              <w:jc w:val="both"/>
+              <w:rPr>
+                <w:b w:val="0"/>
+                <w:bCs w:val="0"/>
+                <w:i w:val="0"/>
+                <w:iCs w:val="0"/>
+                <w:smallCaps w:val="0"/>
+                <w:strike w:val="0"/>
+                <w:color w:val="767171"/>
+                <w:sz w:val="24"/>
+                <w:szCs w:val="24"/>
+                <w:u w:val="none"/>
+                <w:shd w:fill="auto" w:val="clear"/>
+                <w:vertAlign w:val="baseline"/>
+              </w:rPr>
+            </w:pPr>
+            <w:r>
+              <w:rPr>
+                <w:rFonts w:ascii="Calibri" w:cs="Calibri" w:eastAsia="Calibri" w:hAnsi="Calibri"/>
+                <w:b w:val="0"/>
+                <w:bCs w:val="0"/>
+                <w:i w:val="0"/>
+                <w:iCs w:val="0"/>
+                <w:smallCaps w:val="0"/>
+                <w:strike w:val="0"/>
+                <w:color w:val="000000"/>
+                <w:sz w:val="24"/>
+                <w:szCs w:val="24"/>
+                <w:u w:val="none"/>
+                <w:shd w:fill="auto" w:val="clear"/>
+                <w:vertAlign w:val="baseline"/>
+                <w:rtl w:val="0"/>
+              </w:rPr>
+              <w:t xml:space="preserve">¿Cuáles consideras que tienes más desarrolladas y te sientes más seguro aplicando? ¿En cuáles te sientes más débil y requieren ser fortalecidas? </w:t>
+            </w:r>
+          </w:p>
+          <w:p>
+            <w:pPr>
+              <w:numPr>
+                <w:ilvl w:val="0"/>
+                <w:numId w:val="2"/>
+              </w:numPr>
+              <w:spacing w:after="200" w:before="0" w:lineRule="auto"/>
+              <w:ind w:left="720" w:hanging="360"/>
+              <w:jc w:val="both"/>
+              <w:rPr>
+                <w:color w:val="385623"/>
+                <w:sz w:val="24"/>
+                <w:szCs w:val="24"/>
+              </w:rPr>
+            </w:pPr>
+            <w:r>
+              <w:rPr>
+                <w:color w:val="385623"/>
+                <w:sz w:val="24"/>
+                <w:szCs w:val="24"/>
+                <w:rtl w:val="0"/>
+              </w:rPr>
+              <w:t xml:space="preserve">Diseñar y generar soluciones de software innovadoras y de calidad, aplicando el ciclo de vida de éste, según las características del proyecto, las mejores prácticas de la industria y sus estándares de calidad. </w:t>
+            </w:r>
+          </w:p>
+          <w:p>
+            <w:pPr>
+              <w:numPr>
+                <w:ilvl w:val="0"/>
+                <w:numId w:val="2"/>
+              </w:numPr>
+              <w:spacing w:after="200" w:lineRule="auto"/>
+              <w:ind w:left="720" w:hanging="360"/>
+              <w:jc w:val="both"/>
+              <w:rPr>
+                <w:color w:val="ff0000"/>
+                <w:sz w:val="24"/>
+                <w:szCs w:val="24"/>
+              </w:rPr>
+            </w:pPr>
+            <w:r>
+              <w:rPr>
+                <w:color w:val="ff0000"/>
+                <w:sz w:val="24"/>
+                <w:szCs w:val="24"/>
+                <w:rtl w:val="0"/>
+              </w:rPr>
+              <w:t xml:space="preserve">Diseñar y generar soluciones que permitan resolver los requerimientos de información en el contexto de las organizaciones, considerando bases de datos relacionales y no relacionales. </w:t>
+            </w:r>
+          </w:p>
+          <w:p>
+            <w:pPr>
+              <w:numPr>
+                <w:ilvl w:val="0"/>
+                <w:numId w:val="2"/>
+              </w:numPr>
+              <w:spacing w:after="200" w:lineRule="auto"/>
+              <w:ind w:left="720" w:hanging="360"/>
+              <w:jc w:val="both"/>
+              <w:rPr>
+                <w:color w:val="385623"/>
+                <w:sz w:val="24"/>
+                <w:szCs w:val="24"/>
+              </w:rPr>
+            </w:pPr>
+            <w:r>
+              <w:rPr>
+                <w:color w:val="385623"/>
+                <w:sz w:val="24"/>
+                <w:szCs w:val="24"/>
+                <w:rtl w:val="0"/>
+              </w:rPr>
+              <w:t xml:space="preserve">Diseñar y adaptar los procesos de ingeniería de requisitos, a través del uso de metodologías de vanguardia y estándares de la industria, para el desarrollo de soluciones TI complejas, innovadoras y de calidad. </w:t>
+            </w:r>
+          </w:p>
+          <w:p>
+            <w:pPr>
+              <w:numPr>
+                <w:ilvl w:val="0"/>
+                <w:numId w:val="2"/>
+              </w:numPr>
+              <w:spacing w:after="200" w:lineRule="auto"/>
+              <w:ind w:left="720" w:hanging="360"/>
+              <w:jc w:val="both"/>
+              <w:rPr>
+                <w:color w:val="385623"/>
+                <w:sz w:val="24"/>
+                <w:szCs w:val="24"/>
+              </w:rPr>
+            </w:pPr>
+            <w:r>
+              <w:rPr>
+                <w:color w:val="385623"/>
+                <w:sz w:val="24"/>
+                <w:szCs w:val="24"/>
+                <w:rtl w:val="0"/>
+              </w:rPr>
+              <w:t xml:space="preserve">Evaluar y gestionar proyectos en su área de especialización profesional, durante todo el ciclo de vida, de acuerdo a buenas prácticas y utilizando metodologías y herramientas de software, para cumplir con los requerimientos de la organización en contextos tradicionales y ágiles. </w:t>
+            </w:r>
+          </w:p>
+          <w:p>
+            <w:pPr>
+              <w:numPr>
+                <w:ilvl w:val="0"/>
+                <w:numId w:val="2"/>
+              </w:numPr>
+              <w:spacing w:after="200" w:lineRule="auto"/>
+              <w:ind w:left="720" w:hanging="360"/>
+              <w:jc w:val="both"/>
+              <w:rPr>
+                <w:color w:val="ff0000"/>
+                <w:sz w:val="24"/>
+                <w:szCs w:val="24"/>
+              </w:rPr>
+            </w:pPr>
+            <w:r>
+              <w:rPr>
+                <w:color w:val="ff0000"/>
+                <w:sz w:val="24"/>
+                <w:szCs w:val="24"/>
+                <w:rtl w:val="0"/>
+              </w:rPr>
+              <w:t xml:space="preserve">Diseñar soluciones de software, abarcando todo el ciclo de vida de éste, de acuerdo a estándares, marcos de trabajo y regulatorios, tecnologías y metodologías que promueven la innovación, con foco en la calidad, seguridad y sostenibilidad del proyecto. </w:t>
+            </w:r>
+          </w:p>
+          <w:p>
+            <w:pPr>
+              <w:numPr>
+                <w:ilvl w:val="0"/>
+                <w:numId w:val="2"/>
+              </w:numPr>
+              <w:spacing w:after="200" w:lineRule="auto"/>
+              <w:ind w:left="720" w:hanging="360"/>
+              <w:jc w:val="both"/>
+              <w:rPr>
+                <w:color w:val="ff0000"/>
+                <w:sz w:val="24"/>
+                <w:szCs w:val="24"/>
+              </w:rPr>
+            </w:pPr>
+            <w:r>
+              <w:rPr>
+                <w:color w:val="ff0000"/>
+                <w:sz w:val="24"/>
+                <w:szCs w:val="24"/>
+                <w:rtl w:val="0"/>
+              </w:rPr>
+              <w:t xml:space="preserve">Desarrollar proyectos de software innovadores para plataformas y dispositivos móviles, por medio de marcos de trabajo, herramientas de desarrollo, lenguajes de programación y buenas prácticas de la industria del desarrollo de software. </w:t>
+            </w:r>
+          </w:p>
+          <w:p>
+            <w:pPr>
+              <w:tabs>
+                <w:tab w:val="left" w:leader="none" w:pos="454"/>
+              </w:tabs>
+              <w:spacing w:after="240" w:before="240" w:lineRule="auto"/>
+              <w:jc w:val="both"/>
+              <w:rPr>
+                <w:color w:val="434343"/>
+                <w:sz w:val="24"/>
+                <w:szCs w:val="24"/>
+              </w:rPr>
+            </w:pPr>
+            <w:r>
+              <w:rPr>
+                <w:color w:val="434343"/>
+                <w:sz w:val="24"/>
+                <w:szCs w:val="24"/>
+                <w:rtl w:val="0"/>
+              </w:rPr>
+              <w:t xml:space="preserve">Considero que las competencias que tengo más desarrolladas son las relacionadas con el desarrollo de software, análisis de requerimientos y gestión de proyectos. Me siento segura identificando las necesidades de los usuarios, </w:t>
+            </w:r>
+            <w:r>
+              <w:rPr>
+                <w:color w:val="434343"/>
+                <w:sz w:val="24"/>
+                <w:szCs w:val="24"/>
+                <w:rtl w:val="0"/>
+              </w:rPr>
+              <w:t xml:space="preserve">transformándolas</w:t>
+            </w:r>
+            <w:r>
+              <w:rPr>
+                <w:color w:val="434343"/>
+                <w:sz w:val="24"/>
+                <w:szCs w:val="24"/>
+                <w:rtl w:val="0"/>
+              </w:rPr>
+              <w:t xml:space="preserve"> en funcionalidades y participando en el desarrollo de soluciones de software. También me siento cómoda organizando tareas, realizando seguimiento de proyectos y utilizando metodologías ágiles.</w:t>
+            </w:r>
+          </w:p>
+          <w:p>
+            <w:pPr>
+              <w:tabs>
+                <w:tab w:val="left" w:leader="none" w:pos="454"/>
+              </w:tabs>
+              <w:spacing w:after="240" w:before="240" w:lineRule="auto"/>
               <w:jc w:val="both"/>
               <w:rPr>
                 <w:rFonts w:ascii="Calibri" w:cs="Calibri" w:eastAsia="Calibri" w:hAnsi="Calibri"/>
@@ -588,6 +902,436 @@
                 <w:color w:val="1f4e79"/>
               </w:rPr>
             </w:pPr>
+            <w:r>
+              <w:rPr>
+                <w:color w:val="434343"/>
+                <w:sz w:val="24"/>
+                <w:szCs w:val="24"/>
+                <w:rtl w:val="0"/>
+              </w:rPr>
+              <w:t xml:space="preserve">Por otro lado, las competencias que considero que debo fortalecer son principalmente bases de datos, calidad y seguridad de software y desarrollo de aplicaciones móviles. Si bien tengo conocimientos en estas áreas, siento que necesito más práctica, especialmente en bases de datos más complejas, aplicación de medidas de seguridad y desarrollo móvil, para poder </w:t>
+            </w:r>
+            <w:r>
+              <w:rPr>
+                <w:color w:val="434343"/>
+                <w:sz w:val="24"/>
+                <w:szCs w:val="24"/>
+                <w:rtl w:val="0"/>
+              </w:rPr>
+              <w:t xml:space="preserve">desenvolverme con</w:t>
+            </w:r>
+            <w:r>
+              <w:rPr>
+                <w:color w:val="434343"/>
+                <w:sz w:val="24"/>
+                <w:szCs w:val="24"/>
+                <w:rtl w:val="0"/>
+              </w:rPr>
+              <w:t xml:space="preserve"> mayor seguridad en proyectos futuros.</w:t>
+            </w:r>
+            <w:r>
+              <w:rPr>
+                <w:rtl w:val="0"/>
+              </w:rPr>
+            </w:r>
+          </w:p>
+        </w:tc>
+      </w:tr>
+    </w:tbl>
+    <w:p>
+      <w:pPr>
+        <w:spacing w:after="0" w:line="360" w:lineRule="auto"/>
+        <w:jc w:val="both"/>
+        <w:rPr>
+          <w:b w:val="1"/>
+          <w:bCs w:val="1"/>
+          <w:sz w:val="24"/>
+          <w:szCs w:val="24"/>
+        </w:rPr>
+      </w:pPr>
+      <w:r>
+        <w:rPr>
+          <w:rtl w:val="0"/>
+        </w:rPr>
+      </w:r>
+    </w:p>
+    <w:tbl>
+      <w:tblPr>
+        <w:tblStyle w:val="Table5"/>
+        <w:tblW w:w="10076.0" w:type="dxa"/>
+        <w:jc w:val="left"/>
+        <w:tblBorders>
+          <w:top w:color="bfbfbf" w:space="0" w:sz="4" w:val="single"/>
+          <w:left w:color="bfbfbf" w:space="0" w:sz="4" w:val="single"/>
+          <w:bottom w:color="bfbfbf" w:space="0" w:sz="4" w:val="single"/>
+          <w:right w:color="bfbfbf" w:space="0" w:sz="4" w:val="single"/>
+          <w:insideH w:color="bfbfbf" w:space="0" w:sz="4" w:val="single"/>
+          <w:insideV w:color="bfbfbf" w:space="0" w:sz="4" w:val="single"/>
+        </w:tblBorders>
+        <w:tblLayout w:type="fixed"/>
+        <w:tblLook w:val="0400"/>
+      </w:tblPr>
+      <w:tblGrid>
+        <w:gridCol w:w="10076"/>
+        <w:tblGridChange w:id="0">
+          <w:tblGrid>
+            <w:gridCol w:w="10076"/>
+          </w:tblGrid>
+        </w:tblGridChange>
+      </w:tblGrid>
+      <w:tr>
+        <w:trPr>
+          <w:cantSplit w:val="0"/>
+          <w:trHeight w:val="440" w:hRule="atLeast"/>
+          <w:tblHeader w:val="0"/>
+        </w:trPr>
+        <w:tc>
+          <w:tcPr>
+            <w:vAlign w:val="center"/>
+          </w:tcPr>
+          <w:p>
+            <w:pPr>
+              <w:spacing w:after="200" w:before="200" w:lineRule="auto"/>
+              <w:jc w:val="both"/>
+              <w:rPr>
+                <w:color w:val="767171"/>
+                <w:sz w:val="24"/>
+                <w:szCs w:val="24"/>
+              </w:rPr>
+            </w:pPr>
+            <w:r>
+              <w:rPr>
+                <w:sz w:val="24"/>
+                <w:szCs w:val="24"/>
+                <w:rtl w:val="0"/>
+              </w:rPr>
+              <w:t xml:space="preserve">3. A partir de las respuestas anteriores y el perfil de egreso de tu carrera (competencias), responde las siguientes preguntas:</w:t>
+            </w:r>
+            <w:r>
+              <w:rPr>
+                <w:rtl w:val="0"/>
+              </w:rPr>
+            </w:r>
+          </w:p>
+        </w:tc>
+      </w:tr>
+      <w:tr>
+        <w:trPr>
+          <w:cantSplit w:val="0"/>
+          <w:trHeight w:val="440" w:hRule="atLeast"/>
+          <w:tblHeader w:val="0"/>
+        </w:trPr>
+        <w:tc>
+          <w:tcPr>
+            <w:shd w:fill="deeaf6" w:val="clear"/>
+            <w:vAlign w:val="center"/>
+          </w:tcPr>
+          <w:p>
+            <w:pPr>
+              <w:rPr>
+                <w:color w:val="767171"/>
+                <w:sz w:val="24"/>
+                <w:szCs w:val="24"/>
+              </w:rPr>
+            </w:pPr>
+            <w:r>
+              <w:rPr>
+                <w:rtl w:val="0"/>
+              </w:rPr>
+            </w:r>
+          </w:p>
+          <w:p>
+            <w:pPr>
+              <w:keepNext w:val="0"/>
+              <w:keepLines w:val="0"/>
+              <w:pageBreakBefore w:val="0"/>
+              <w:widowControl w:val="1"/>
+              <w:numPr>
+                <w:ilvl w:val="0"/>
+                <w:numId w:val="1"/>
+              </w:numPr>
+              <w:pBdr>
+                <w:top w:space="0" w:sz="0" w:val="nil"/>
+                <w:left w:space="0" w:sz="0" w:val="nil"/>
+                <w:bottom w:space="0" w:sz="0" w:val="nil"/>
+                <w:right w:space="0" w:sz="0" w:val="nil"/>
+                <w:between w:space="0" w:sz="0" w:val="nil"/>
+              </w:pBdr>
+              <w:shd w:fill="auto" w:val="clear"/>
+              <w:tabs>
+                <w:tab w:val="left" w:leader="none" w:pos="454"/>
+              </w:tabs>
+              <w:spacing w:after="160" w:before="0" w:line="259" w:lineRule="auto"/>
+              <w:ind w:left="454" w:right="0" w:hanging="283"/>
+              <w:jc w:val="both"/>
+              <w:rPr>
+                <w:b w:val="0"/>
+                <w:bCs w:val="0"/>
+                <w:i w:val="0"/>
+                <w:iCs w:val="0"/>
+                <w:smallCaps w:val="0"/>
+                <w:strike w:val="0"/>
+                <w:color w:val="767171"/>
+                <w:sz w:val="24"/>
+                <w:szCs w:val="24"/>
+                <w:u w:val="none"/>
+                <w:shd w:fill="auto" w:val="clear"/>
+                <w:vertAlign w:val="baseline"/>
+              </w:rPr>
+            </w:pPr>
+            <w:r>
+              <w:rPr>
+                <w:rFonts w:ascii="Calibri" w:cs="Calibri" w:eastAsia="Calibri" w:hAnsi="Calibri"/>
+                <w:b w:val="0"/>
+                <w:bCs w:val="0"/>
+                <w:i w:val="0"/>
+                <w:iCs w:val="0"/>
+                <w:smallCaps w:val="0"/>
+                <w:strike w:val="0"/>
+                <w:color w:val="000000"/>
+                <w:sz w:val="24"/>
+                <w:szCs w:val="24"/>
+                <w:u w:val="none"/>
+                <w:shd w:fill="auto" w:val="clear"/>
+                <w:vertAlign w:val="baseline"/>
+                <w:rtl w:val="0"/>
+              </w:rPr>
+              <w:t xml:space="preserve">¿Cuáles son tus principales intereses profesionales? ¿Hay alguna área de desempeño que te interese más?</w:t>
+            </w:r>
+            <w:r>
+              <w:rPr>
+                <w:rtl w:val="0"/>
+              </w:rPr>
+            </w:r>
+          </w:p>
+          <w:p>
+            <w:pPr>
+              <w:keepNext w:val="0"/>
+              <w:keepLines w:val="0"/>
+              <w:pageBreakBefore w:val="0"/>
+              <w:widowControl w:val="1"/>
+              <w:pBdr>
+                <w:top w:space="0" w:sz="0" w:val="nil"/>
+                <w:left w:space="0" w:sz="0" w:val="nil"/>
+                <w:bottom w:space="0" w:sz="0" w:val="nil"/>
+                <w:right w:space="0" w:sz="0" w:val="nil"/>
+                <w:between w:space="0" w:sz="0" w:val="nil"/>
+              </w:pBdr>
+              <w:shd w:fill="auto" w:val="clear"/>
+              <w:tabs>
+                <w:tab w:val="left" w:leader="none" w:pos="454"/>
+              </w:tabs>
+              <w:spacing w:after="160" w:before="0" w:line="259" w:lineRule="auto"/>
+              <w:ind w:left="0" w:right="0" w:firstLine="0"/>
+              <w:jc w:val="both"/>
+              <w:rPr>
+                <w:color w:val="767171"/>
+                <w:sz w:val="24"/>
+                <w:szCs w:val="24"/>
+              </w:rPr>
+            </w:pPr>
+            <w:r>
+              <w:rPr>
+                <w:color w:val="434343"/>
+                <w:sz w:val="24"/>
+                <w:szCs w:val="24"/>
+                <w:rtl w:val="0"/>
+              </w:rPr>
+              <w:t xml:space="preserve">Mis principales intereses profesionales son el desarrollo de software, la gestión de proyectos y el análisis de datos. El análisis de datos me parece interesante, aunque considero que todavía necesito fortalecer bastante mis conocimientos en esa área. </w:t>
+            </w:r>
+            <w:r>
+              <w:rPr>
+                <w:rtl w:val="0"/>
+              </w:rPr>
+            </w:r>
+          </w:p>
+          <w:p>
+            <w:pPr>
+              <w:keepNext w:val="0"/>
+              <w:keepLines w:val="0"/>
+              <w:pageBreakBefore w:val="0"/>
+              <w:widowControl w:val="1"/>
+              <w:numPr>
+                <w:ilvl w:val="0"/>
+                <w:numId w:val="1"/>
+              </w:numPr>
+              <w:pBdr>
+                <w:top w:space="0" w:sz="0" w:val="nil"/>
+                <w:left w:space="0" w:sz="0" w:val="nil"/>
+                <w:bottom w:space="0" w:sz="0" w:val="nil"/>
+                <w:right w:space="0" w:sz="0" w:val="nil"/>
+                <w:between w:space="0" w:sz="0" w:val="nil"/>
+              </w:pBdr>
+              <w:shd w:fill="auto" w:val="clear"/>
+              <w:tabs>
+                <w:tab w:val="left" w:leader="none" w:pos="454"/>
+              </w:tabs>
+              <w:spacing w:after="160" w:before="0" w:line="259" w:lineRule="auto"/>
+              <w:ind w:left="454" w:right="0" w:hanging="283"/>
+              <w:jc w:val="both"/>
+              <w:rPr>
+                <w:b w:val="0"/>
+                <w:bCs w:val="0"/>
+                <w:i w:val="0"/>
+                <w:iCs w:val="0"/>
+                <w:smallCaps w:val="0"/>
+                <w:strike w:val="0"/>
+                <w:color w:val="767171"/>
+                <w:sz w:val="24"/>
+                <w:szCs w:val="24"/>
+                <w:u w:val="none"/>
+                <w:shd w:fill="auto" w:val="clear"/>
+                <w:vertAlign w:val="baseline"/>
+              </w:rPr>
+            </w:pPr>
+            <w:r>
+              <w:rPr>
+                <w:rFonts w:ascii="Calibri" w:cs="Calibri" w:eastAsia="Calibri" w:hAnsi="Calibri"/>
+                <w:b w:val="0"/>
+                <w:bCs w:val="0"/>
+                <w:i w:val="0"/>
+                <w:iCs w:val="0"/>
+                <w:smallCaps w:val="0"/>
+                <w:strike w:val="0"/>
+                <w:color w:val="000000"/>
+                <w:sz w:val="24"/>
+                <w:szCs w:val="24"/>
+                <w:u w:val="none"/>
+                <w:shd w:fill="auto" w:val="clear"/>
+                <w:vertAlign w:val="baseline"/>
+                <w:rtl w:val="0"/>
+              </w:rPr>
+              <w:t xml:space="preserve">¿Cuáles son las principales competencias que se relacionan con tus intereses profesionales? ¿Hay alguna de ellas que sientas que requieres especialmente fortalecer?</w:t>
+            </w:r>
+            <w:r>
+              <w:rPr>
+                <w:rtl w:val="0"/>
+              </w:rPr>
+            </w:r>
+          </w:p>
+          <w:p>
+            <w:pPr>
+              <w:tabs>
+                <w:tab w:val="left" w:leader="none" w:pos="454"/>
+              </w:tabs>
+              <w:spacing w:after="200" w:lineRule="auto"/>
+              <w:jc w:val="both"/>
+              <w:rPr>
+                <w:color w:val="767171"/>
+                <w:sz w:val="24"/>
+                <w:szCs w:val="24"/>
+              </w:rPr>
+            </w:pPr>
+            <w:r>
+              <w:rPr>
+                <w:color w:val="434343"/>
+                <w:sz w:val="24"/>
+                <w:szCs w:val="24"/>
+                <w:rtl w:val="0"/>
+              </w:rPr>
+              <w:t xml:space="preserve">Las competencias que más se relacionan con mis intereses son el desarrollo de software, análisis de requerimientos y gestión de proyectos. También me gustaría reforzar bases de datos, análisis de datos, calidad y seguridad de software. </w:t>
+            </w:r>
+            <w:r>
+              <w:rPr>
+                <w:rtl w:val="0"/>
+              </w:rPr>
+            </w:r>
+          </w:p>
+          <w:p>
+            <w:pPr>
+              <w:keepNext w:val="0"/>
+              <w:keepLines w:val="0"/>
+              <w:pageBreakBefore w:val="0"/>
+              <w:widowControl w:val="1"/>
+              <w:numPr>
+                <w:ilvl w:val="0"/>
+                <w:numId w:val="1"/>
+              </w:numPr>
+              <w:pBdr>
+                <w:top w:space="0" w:sz="0" w:val="nil"/>
+                <w:left w:space="0" w:sz="0" w:val="nil"/>
+                <w:bottom w:space="0" w:sz="0" w:val="nil"/>
+                <w:right w:space="0" w:sz="0" w:val="nil"/>
+                <w:between w:space="0" w:sz="0" w:val="nil"/>
+              </w:pBdr>
+              <w:shd w:fill="auto" w:val="clear"/>
+              <w:tabs>
+                <w:tab w:val="left" w:leader="none" w:pos="454"/>
+              </w:tabs>
+              <w:spacing w:after="160" w:before="0" w:line="259" w:lineRule="auto"/>
+              <w:ind w:left="454" w:right="0" w:hanging="283"/>
+              <w:jc w:val="both"/>
+              <w:rPr>
+                <w:b w:val="0"/>
+                <w:bCs w:val="0"/>
+                <w:i w:val="0"/>
+                <w:iCs w:val="0"/>
+                <w:smallCaps w:val="0"/>
+                <w:strike w:val="0"/>
+                <w:color w:val="767171"/>
+                <w:sz w:val="24"/>
+                <w:szCs w:val="24"/>
+                <w:u w:val="none"/>
+                <w:shd w:fill="auto" w:val="clear"/>
+                <w:vertAlign w:val="baseline"/>
+              </w:rPr>
+            </w:pPr>
+            <w:r>
+              <w:rPr>
+                <w:rFonts w:ascii="Calibri" w:cs="Calibri" w:eastAsia="Calibri" w:hAnsi="Calibri"/>
+                <w:b w:val="0"/>
+                <w:bCs w:val="0"/>
+                <w:i w:val="0"/>
+                <w:iCs w:val="0"/>
+                <w:smallCaps w:val="0"/>
+                <w:strike w:val="0"/>
+                <w:color w:val="000000"/>
+                <w:sz w:val="24"/>
+                <w:szCs w:val="24"/>
+                <w:u w:val="none"/>
+                <w:shd w:fill="auto" w:val="clear"/>
+                <w:vertAlign w:val="baseline"/>
+                <w:rtl w:val="0"/>
+              </w:rPr>
+              <w:t xml:space="preserve">¿Cómo te gustaría que fuera tu escenario laboral en 5 años más? ¿Qué te gustaría estar haciendo?</w:t>
+            </w:r>
+            <w:r>
+              <w:rPr>
+                <w:rtl w:val="0"/>
+              </w:rPr>
+            </w:r>
+          </w:p>
+          <w:p>
+            <w:pPr>
+              <w:tabs>
+                <w:tab w:val="left" w:leader="none" w:pos="454"/>
+              </w:tabs>
+              <w:jc w:val="both"/>
+              <w:rPr>
+                <w:rFonts w:ascii="Calibri" w:cs="Calibri" w:eastAsia="Calibri" w:hAnsi="Calibri"/>
+                <w:b w:val="1"/>
+                <w:bCs w:val="1"/>
+                <w:color w:val="1f4e79"/>
+              </w:rPr>
+            </w:pPr>
+            <w:r>
+              <w:rPr>
+                <w:color w:val="434343"/>
+                <w:sz w:val="24"/>
+                <w:szCs w:val="24"/>
+                <w:rtl w:val="0"/>
+              </w:rPr>
+              <w:t xml:space="preserve">En cinco años me gustaría estar trabajando en el área informática, participando en proyectos de software, adquiriendo mayor experiencia y responsabilidades, y aprendiendo nuevas tecnologías.</w:t>
+            </w:r>
+            <w:r>
+              <w:rPr>
+                <w:color w:val="434343"/>
+                <w:sz w:val="24"/>
+                <w:szCs w:val="24"/>
+                <w:rtl w:val="0"/>
+              </w:rPr>
+              <w:t xml:space="preserve"> </w:t>
+            </w:r>
             <w:r>
               <w:rPr>
                 <w:rtl w:val="0"/>
@@ -673,598 +1417,6 @@
           <w:sz w:val="24"/>
           <w:szCs w:val="24"/>
         </w:rPr>
-      </w:pPr>
-      <w:r>
-        <w:rPr>
-          <w:rtl w:val="0"/>
-        </w:rPr>
-      </w:r>
-    </w:p>
-    <w:p>
-      <w:pPr>
-        <w:spacing w:after="0" w:line="360" w:lineRule="auto"/>
-        <w:jc w:val="both"/>
-        <w:rPr>
-          <w:b w:val="1"/>
-          <w:bCs w:val="1"/>
-          <w:sz w:val="24"/>
-          <w:szCs w:val="24"/>
-        </w:rPr>
-      </w:pPr>
-      <w:r>
-        <w:rPr>
-          <w:rtl w:val="0"/>
-        </w:rPr>
-      </w:r>
-    </w:p>
-    <w:tbl>
-      <w:tblPr>
-        <w:tblStyle w:val="Table4"/>
-        <w:tblW w:w="10076.0" w:type="dxa"/>
-        <w:jc w:val="left"/>
-        <w:tblBorders>
-          <w:top w:color="bfbfbf" w:space="0" w:sz="4" w:val="single"/>
-          <w:left w:color="bfbfbf" w:space="0" w:sz="4" w:val="single"/>
-          <w:bottom w:color="bfbfbf" w:space="0" w:sz="4" w:val="single"/>
-          <w:right w:color="bfbfbf" w:space="0" w:sz="4" w:val="single"/>
-          <w:insideH w:color="bfbfbf" w:space="0" w:sz="4" w:val="single"/>
-          <w:insideV w:color="bfbfbf" w:space="0" w:sz="4" w:val="single"/>
-        </w:tblBorders>
-        <w:tblLayout w:type="fixed"/>
-        <w:tblLook w:val="0400"/>
-      </w:tblPr>
-      <w:tblGrid>
-        <w:gridCol w:w="10076"/>
-        <w:tblGridChange w:id="0">
-          <w:tblGrid>
-            <w:gridCol w:w="10076"/>
-          </w:tblGrid>
-        </w:tblGridChange>
-      </w:tblGrid>
-      <w:tr>
-        <w:trPr>
-          <w:cantSplit w:val="0"/>
-          <w:trHeight w:val="440" w:hRule="atLeast"/>
-          <w:tblHeader w:val="0"/>
-        </w:trPr>
-        <w:tc>
-          <w:tcPr>
-            <w:vAlign w:val="center"/>
-          </w:tcPr>
-          <w:p>
-            <w:pPr>
-              <w:jc w:val="both"/>
-              <w:rPr>
-                <w:color w:val="767171"/>
-                <w:sz w:val="24"/>
-                <w:szCs w:val="24"/>
-              </w:rPr>
-            </w:pPr>
-            <w:r>
-              <w:rPr>
-                <w:sz w:val="24"/>
-                <w:szCs w:val="24"/>
-                <w:rtl w:val="0"/>
-              </w:rPr>
-              <w:t xml:space="preserve">2. Revisa las competencias y unidades de competencias correspondientes a cada asignatura de la malla de tu carrera. Marca en </w:t>
-            </w:r>
-            <w:r>
-              <w:rPr>
-                <w:b w:val="1"/>
-                <w:bCs w:val="1"/>
-                <w:color w:val="385623"/>
-                <w:sz w:val="24"/>
-                <w:szCs w:val="24"/>
-                <w:rtl w:val="0"/>
-              </w:rPr>
-              <w:t xml:space="preserve">verde</w:t>
-            </w:r>
-            <w:r>
-              <w:rPr>
-                <w:color w:val="385623"/>
-                <w:sz w:val="24"/>
-                <w:szCs w:val="24"/>
-                <w:rtl w:val="0"/>
-              </w:rPr>
-              <w:t xml:space="preserve"> </w:t>
-            </w:r>
-            <w:r>
-              <w:rPr>
-                <w:sz w:val="24"/>
-                <w:szCs w:val="24"/>
-                <w:rtl w:val="0"/>
-              </w:rPr>
-              <w:t xml:space="preserve">las competencias o unidades de competencia que consideras son tus </w:t>
-            </w:r>
-            <w:r>
-              <w:rPr>
-                <w:b w:val="1"/>
-                <w:bCs w:val="1"/>
-                <w:color w:val="385623"/>
-                <w:sz w:val="24"/>
-                <w:szCs w:val="24"/>
-                <w:rtl w:val="0"/>
-              </w:rPr>
-              <w:t xml:space="preserve">fortalezas</w:t>
-            </w:r>
-            <w:r>
-              <w:rPr>
-                <w:color w:val="385623"/>
-                <w:sz w:val="24"/>
-                <w:szCs w:val="24"/>
-                <w:rtl w:val="0"/>
-              </w:rPr>
-              <w:t xml:space="preserve"> </w:t>
-            </w:r>
-            <w:r>
-              <w:rPr>
-                <w:sz w:val="24"/>
-                <w:szCs w:val="24"/>
-                <w:rtl w:val="0"/>
-              </w:rPr>
-              <w:t xml:space="preserve">y en </w:t>
-            </w:r>
-            <w:r>
-              <w:rPr>
-                <w:b w:val="1"/>
-                <w:bCs w:val="1"/>
-                <w:color w:val="ff0000"/>
-                <w:sz w:val="24"/>
-                <w:szCs w:val="24"/>
-                <w:rtl w:val="0"/>
-              </w:rPr>
-              <w:t xml:space="preserve">rojo</w:t>
-            </w:r>
-            <w:r>
-              <w:rPr>
-                <w:sz w:val="24"/>
-                <w:szCs w:val="24"/>
-                <w:rtl w:val="0"/>
-              </w:rPr>
-              <w:t xml:space="preserve"> las que requieren ser fortalecidas. A partir de este ejercicio responde:</w:t>
-            </w:r>
-            <w:r>
-              <w:rPr>
-                <w:rtl w:val="0"/>
-              </w:rPr>
-            </w:r>
-          </w:p>
-        </w:tc>
-      </w:tr>
-      <w:tr>
-        <w:trPr>
-          <w:cantSplit w:val="0"/>
-          <w:trHeight w:val="440" w:hRule="atLeast"/>
-          <w:tblHeader w:val="0"/>
-        </w:trPr>
-        <w:tc>
-          <w:tcPr>
-            <w:shd w:fill="deeaf6" w:val="clear"/>
-            <w:vAlign w:val="center"/>
-          </w:tcPr>
-          <w:p>
-            <w:pPr>
-              <w:jc w:val="both"/>
-              <w:rPr>
-                <w:color w:val="767171"/>
-                <w:sz w:val="24"/>
-                <w:szCs w:val="24"/>
-              </w:rPr>
-            </w:pPr>
-            <w:r>
-              <w:rPr>
-                <w:rtl w:val="0"/>
-              </w:rPr>
-            </w:r>
-          </w:p>
-          <w:p>
-            <w:pPr>
-              <w:keepNext w:val="0"/>
-              <w:keepLines w:val="0"/>
-              <w:pageBreakBefore w:val="0"/>
-              <w:widowControl w:val="1"/>
-              <w:numPr>
-                <w:ilvl w:val="0"/>
-                <w:numId w:val="1"/>
-              </w:numPr>
-              <w:pBdr>
-                <w:top w:space="0" w:sz="0" w:val="nil"/>
-                <w:left w:space="0" w:sz="0" w:val="nil"/>
-                <w:bottom w:space="0" w:sz="0" w:val="nil"/>
-                <w:right w:space="0" w:sz="0" w:val="nil"/>
-                <w:between w:space="0" w:sz="0" w:val="nil"/>
-              </w:pBdr>
-              <w:shd w:fill="auto" w:val="clear"/>
-              <w:tabs>
-                <w:tab w:val="left" w:leader="none" w:pos="454"/>
-              </w:tabs>
-              <w:spacing w:after="160" w:before="0" w:line="259" w:lineRule="auto"/>
-              <w:ind w:left="454" w:right="0" w:hanging="283"/>
-              <w:jc w:val="both"/>
-              <w:rPr>
-                <w:b w:val="0"/>
-                <w:bCs w:val="0"/>
-                <w:i w:val="0"/>
-                <w:iCs w:val="0"/>
-                <w:smallCaps w:val="0"/>
-                <w:strike w:val="0"/>
-                <w:color w:val="767171"/>
-                <w:sz w:val="24"/>
-                <w:szCs w:val="24"/>
-                <w:u w:val="none"/>
-                <w:shd w:fill="auto" w:val="clear"/>
-                <w:vertAlign w:val="baseline"/>
-              </w:rPr>
-            </w:pPr>
-            <w:r>
-              <w:rPr>
-                <w:rFonts w:ascii="Calibri" w:cs="Calibri" w:eastAsia="Calibri" w:hAnsi="Calibri"/>
-                <w:b w:val="0"/>
-                <w:bCs w:val="0"/>
-                <w:i w:val="0"/>
-                <w:iCs w:val="0"/>
-                <w:smallCaps w:val="0"/>
-                <w:strike w:val="0"/>
-                <w:color w:val="000000"/>
-                <w:sz w:val="24"/>
-                <w:szCs w:val="24"/>
-                <w:u w:val="none"/>
-                <w:shd w:fill="auto" w:val="clear"/>
-                <w:vertAlign w:val="baseline"/>
-                <w:rtl w:val="0"/>
-              </w:rPr>
-              <w:t xml:space="preserve">¿Cuáles consideras que tienes más desarrolladas y te sientes más seguro aplicando? ¿En cuáles te sientes más débil y requieren ser fortalecidas? </w:t>
-            </w:r>
-            <w:r>
-              <w:rPr>
-                <w:rtl w:val="0"/>
-              </w:rPr>
-            </w:r>
-          </w:p>
-          <w:p>
-            <w:pPr>
-              <w:tabs>
-                <w:tab w:val="left" w:leader="none" w:pos="454"/>
-              </w:tabs>
-              <w:jc w:val="both"/>
-              <w:rPr>
-                <w:color w:val="767171"/>
-                <w:sz w:val="24"/>
-                <w:szCs w:val="24"/>
-              </w:rPr>
-            </w:pPr>
-            <w:r>
-              <w:rPr>
-                <w:rtl w:val="0"/>
-              </w:rPr>
-            </w:r>
-          </w:p>
-          <w:p>
-            <w:pPr>
-              <w:tabs>
-                <w:tab w:val="left" w:leader="none" w:pos="454"/>
-              </w:tabs>
-              <w:jc w:val="both"/>
-              <w:rPr>
-                <w:color w:val="767171"/>
-                <w:sz w:val="24"/>
-                <w:szCs w:val="24"/>
-              </w:rPr>
-            </w:pPr>
-            <w:r>
-              <w:rPr>
-                <w:rtl w:val="0"/>
-              </w:rPr>
-            </w:r>
-          </w:p>
-          <w:p>
-            <w:pPr>
-              <w:tabs>
-                <w:tab w:val="left" w:leader="none" w:pos="454"/>
-              </w:tabs>
-              <w:jc w:val="both"/>
-              <w:rPr>
-                <w:color w:val="767171"/>
-                <w:sz w:val="24"/>
-                <w:szCs w:val="24"/>
-              </w:rPr>
-            </w:pPr>
-            <w:r>
-              <w:rPr>
-                <w:rtl w:val="0"/>
-              </w:rPr>
-            </w:r>
-          </w:p>
-          <w:p>
-            <w:pPr>
-              <w:tabs>
-                <w:tab w:val="left" w:leader="none" w:pos="454"/>
-              </w:tabs>
-              <w:jc w:val="both"/>
-              <w:rPr>
-                <w:color w:val="767171"/>
-                <w:sz w:val="24"/>
-                <w:szCs w:val="24"/>
-              </w:rPr>
-            </w:pPr>
-            <w:r>
-              <w:rPr>
-                <w:rtl w:val="0"/>
-              </w:rPr>
-            </w:r>
-          </w:p>
-          <w:p>
-            <w:pPr>
-              <w:tabs>
-                <w:tab w:val="left" w:leader="none" w:pos="454"/>
-              </w:tabs>
-              <w:jc w:val="both"/>
-              <w:rPr>
-                <w:color w:val="767171"/>
-                <w:sz w:val="24"/>
-                <w:szCs w:val="24"/>
-              </w:rPr>
-            </w:pPr>
-            <w:r>
-              <w:rPr>
-                <w:rtl w:val="0"/>
-              </w:rPr>
-            </w:r>
-          </w:p>
-          <w:p>
-            <w:pPr>
-              <w:tabs>
-                <w:tab w:val="left" w:leader="none" w:pos="454"/>
-              </w:tabs>
-              <w:jc w:val="both"/>
-              <w:rPr>
-                <w:color w:val="767171"/>
-                <w:sz w:val="24"/>
-                <w:szCs w:val="24"/>
-              </w:rPr>
-            </w:pPr>
-            <w:r>
-              <w:rPr>
-                <w:rtl w:val="0"/>
-              </w:rPr>
-            </w:r>
-          </w:p>
-          <w:p>
-            <w:pPr>
-              <w:tabs>
-                <w:tab w:val="left" w:leader="none" w:pos="454"/>
-              </w:tabs>
-              <w:jc w:val="both"/>
-              <w:rPr>
-                <w:color w:val="767171"/>
-                <w:sz w:val="24"/>
-                <w:szCs w:val="24"/>
-              </w:rPr>
-            </w:pPr>
-            <w:r>
-              <w:rPr>
-                <w:rtl w:val="0"/>
-              </w:rPr>
-            </w:r>
-          </w:p>
-          <w:p>
-            <w:pPr>
-              <w:tabs>
-                <w:tab w:val="left" w:leader="none" w:pos="454"/>
-              </w:tabs>
-              <w:jc w:val="both"/>
-              <w:rPr>
-                <w:color w:val="767171"/>
-                <w:sz w:val="24"/>
-                <w:szCs w:val="24"/>
-              </w:rPr>
-            </w:pPr>
-            <w:r>
-              <w:rPr>
-                <w:rtl w:val="0"/>
-              </w:rPr>
-            </w:r>
-          </w:p>
-          <w:p>
-            <w:pPr>
-              <w:tabs>
-                <w:tab w:val="left" w:leader="none" w:pos="454"/>
-              </w:tabs>
-              <w:jc w:val="both"/>
-              <w:rPr>
-                <w:color w:val="767171"/>
-                <w:sz w:val="24"/>
-                <w:szCs w:val="24"/>
-              </w:rPr>
-            </w:pPr>
-            <w:r>
-              <w:rPr>
-                <w:rtl w:val="0"/>
-              </w:rPr>
-            </w:r>
-          </w:p>
-          <w:p>
-            <w:pPr>
-              <w:tabs>
-                <w:tab w:val="left" w:leader="none" w:pos="454"/>
-              </w:tabs>
-              <w:ind w:left="171" w:firstLine="0"/>
-              <w:jc w:val="both"/>
-              <w:rPr>
-                <w:color w:val="767171"/>
-                <w:sz w:val="24"/>
-                <w:szCs w:val="24"/>
-              </w:rPr>
-            </w:pPr>
-            <w:r>
-              <w:rPr>
-                <w:rtl w:val="0"/>
-              </w:rPr>
-            </w:r>
-          </w:p>
-          <w:p>
-            <w:pPr>
-              <w:jc w:val="both"/>
-              <w:rPr>
-                <w:color w:val="767171"/>
-                <w:sz w:val="24"/>
-                <w:szCs w:val="24"/>
-              </w:rPr>
-            </w:pPr>
-            <w:r>
-              <w:rPr>
-                <w:rtl w:val="0"/>
-              </w:rPr>
-            </w:r>
-          </w:p>
-          <w:p>
-            <w:pPr>
-              <w:jc w:val="both"/>
-              <w:rPr>
-                <w:rFonts w:ascii="Calibri" w:cs="Calibri" w:eastAsia="Calibri" w:hAnsi="Calibri"/>
-                <w:b w:val="1"/>
-                <w:bCs w:val="1"/>
-              </w:rPr>
-            </w:pPr>
-            <w:r>
-              <w:rPr>
-                <w:rtl w:val="0"/>
-              </w:rPr>
-            </w:r>
-          </w:p>
-          <w:p>
-            <w:pPr>
-              <w:jc w:val="both"/>
-              <w:rPr>
-                <w:rFonts w:ascii="Calibri" w:cs="Calibri" w:eastAsia="Calibri" w:hAnsi="Calibri"/>
-                <w:b w:val="1"/>
-                <w:bCs w:val="1"/>
-              </w:rPr>
-            </w:pPr>
-            <w:r>
-              <w:rPr>
-                <w:rtl w:val="0"/>
-              </w:rPr>
-            </w:r>
-          </w:p>
-          <w:p>
-            <w:pPr>
-              <w:jc w:val="both"/>
-              <w:rPr>
-                <w:rFonts w:ascii="Calibri" w:cs="Calibri" w:eastAsia="Calibri" w:hAnsi="Calibri"/>
-                <w:b w:val="1"/>
-                <w:bCs w:val="1"/>
-              </w:rPr>
-            </w:pPr>
-            <w:r>
-              <w:rPr>
-                <w:rtl w:val="0"/>
-              </w:rPr>
-            </w:r>
-          </w:p>
-          <w:p>
-            <w:pPr>
-              <w:jc w:val="both"/>
-              <w:rPr>
-                <w:rFonts w:ascii="Calibri" w:cs="Calibri" w:eastAsia="Calibri" w:hAnsi="Calibri"/>
-                <w:b w:val="1"/>
-                <w:bCs w:val="1"/>
-              </w:rPr>
-            </w:pPr>
-            <w:r>
-              <w:rPr>
-                <w:rtl w:val="0"/>
-              </w:rPr>
-            </w:r>
-          </w:p>
-          <w:p>
-            <w:pPr>
-              <w:jc w:val="both"/>
-              <w:rPr>
-                <w:rFonts w:ascii="Calibri" w:cs="Calibri" w:eastAsia="Calibri" w:hAnsi="Calibri"/>
-                <w:b w:val="1"/>
-                <w:bCs w:val="1"/>
-              </w:rPr>
-            </w:pPr>
-            <w:r>
-              <w:rPr>
-                <w:rtl w:val="0"/>
-              </w:rPr>
-            </w:r>
-          </w:p>
-          <w:p>
-            <w:pPr>
-              <w:jc w:val="both"/>
-              <w:rPr>
-                <w:rFonts w:ascii="Calibri" w:cs="Calibri" w:eastAsia="Calibri" w:hAnsi="Calibri"/>
-                <w:b w:val="1"/>
-                <w:bCs w:val="1"/>
-              </w:rPr>
-            </w:pPr>
-            <w:r>
-              <w:rPr>
-                <w:rtl w:val="0"/>
-              </w:rPr>
-            </w:r>
-          </w:p>
-          <w:p>
-            <w:pPr>
-              <w:jc w:val="both"/>
-              <w:rPr>
-                <w:rFonts w:ascii="Calibri" w:cs="Calibri" w:eastAsia="Calibri" w:hAnsi="Calibri"/>
-                <w:b w:val="1"/>
-                <w:bCs w:val="1"/>
-                <w:color w:val="1f4e79"/>
-              </w:rPr>
-            </w:pPr>
-            <w:r>
-              <w:rPr>
-                <w:rtl w:val="0"/>
-              </w:rPr>
-            </w:r>
-          </w:p>
-        </w:tc>
-      </w:tr>
-    </w:tbl>
-    <w:p>
-      <w:pPr>
-        <w:spacing w:after="0" w:line="360" w:lineRule="auto"/>
-        <w:jc w:val="both"/>
-        <w:rPr>
-          <w:color w:val="595959"/>
-          <w:sz w:val="24"/>
-          <w:szCs w:val="24"/>
-        </w:rPr>
-      </w:pPr>
-      <w:r>
-        <w:rPr>
-          <w:rtl w:val="0"/>
-        </w:rPr>
-      </w:r>
-    </w:p>
-    <w:p>
-      <w:pPr>
-        <w:rPr/>
-      </w:pPr>
-      <w:r>
-        <w:rPr>
-          <w:rtl w:val="0"/>
-        </w:rPr>
-      </w:r>
-    </w:p>
-    <w:p>
-      <w:pPr>
-        <w:rPr/>
-      </w:pPr>
-      <w:r>
-        <w:rPr>
-          <w:rtl w:val="0"/>
-        </w:rPr>
-      </w:r>
-    </w:p>
-    <w:p>
-      <w:pPr>
-        <w:rPr/>
       </w:pPr>
       <w:r>
         <w:rPr>
@@ -1427,819 +1579,6 @@
     </w:p>
     <w:tbl>
       <w:tblPr>
-        <w:tblStyle w:val="Table5"/>
-        <w:tblW w:w="10076.0" w:type="dxa"/>
-        <w:jc w:val="left"/>
-        <w:tblBorders>
-          <w:top w:color="bfbfbf" w:space="0" w:sz="4" w:val="single"/>
-          <w:left w:color="bfbfbf" w:space="0" w:sz="4" w:val="single"/>
-          <w:bottom w:color="bfbfbf" w:space="0" w:sz="4" w:val="single"/>
-          <w:right w:color="bfbfbf" w:space="0" w:sz="4" w:val="single"/>
-          <w:insideH w:color="bfbfbf" w:space="0" w:sz="4" w:val="single"/>
-          <w:insideV w:color="bfbfbf" w:space="0" w:sz="4" w:val="single"/>
-        </w:tblBorders>
-        <w:tblLayout w:type="fixed"/>
-        <w:tblLook w:val="0400"/>
-      </w:tblPr>
-      <w:tblGrid>
-        <w:gridCol w:w="10076"/>
-        <w:tblGridChange w:id="0">
-          <w:tblGrid>
-            <w:gridCol w:w="10076"/>
-          </w:tblGrid>
-        </w:tblGridChange>
-      </w:tblGrid>
-      <w:tr>
-        <w:trPr>
-          <w:cantSplit w:val="0"/>
-          <w:trHeight w:val="440" w:hRule="atLeast"/>
-          <w:tblHeader w:val="0"/>
-        </w:trPr>
-        <w:tc>
-          <w:tcPr>
-            <w:vAlign w:val="center"/>
-          </w:tcPr>
-          <w:p>
-            <w:pPr>
-              <w:jc w:val="both"/>
-              <w:rPr>
-                <w:color w:val="767171"/>
-                <w:sz w:val="24"/>
-                <w:szCs w:val="24"/>
-              </w:rPr>
-            </w:pPr>
-            <w:r>
-              <w:rPr>
-                <w:sz w:val="24"/>
-                <w:szCs w:val="24"/>
-                <w:rtl w:val="0"/>
-              </w:rPr>
-              <w:t xml:space="preserve">3. A partir de las respuestas anteriores y el perfil de egreso de tu carrera (competencias), responde las siguientes preguntas:</w:t>
-            </w:r>
-            <w:r>
-              <w:rPr>
-                <w:rtl w:val="0"/>
-              </w:rPr>
-            </w:r>
-          </w:p>
-        </w:tc>
-      </w:tr>
-      <w:tr>
-        <w:trPr>
-          <w:cantSplit w:val="0"/>
-          <w:trHeight w:val="440" w:hRule="atLeast"/>
-          <w:tblHeader w:val="0"/>
-        </w:trPr>
-        <w:tc>
-          <w:tcPr>
-            <w:shd w:fill="deeaf6" w:val="clear"/>
-            <w:vAlign w:val="center"/>
-          </w:tcPr>
-          <w:p>
-            <w:pPr>
-              <w:rPr>
-                <w:color w:val="767171"/>
-                <w:sz w:val="24"/>
-                <w:szCs w:val="24"/>
-              </w:rPr>
-            </w:pPr>
-            <w:r>
-              <w:rPr>
-                <w:rtl w:val="0"/>
-              </w:rPr>
-            </w:r>
-          </w:p>
-          <w:p>
-            <w:pPr>
-              <w:keepNext w:val="0"/>
-              <w:keepLines w:val="0"/>
-              <w:pageBreakBefore w:val="0"/>
-              <w:widowControl w:val="1"/>
-              <w:numPr>
-                <w:ilvl w:val="0"/>
-                <w:numId w:val="1"/>
-              </w:numPr>
-              <w:pBdr>
-                <w:top w:space="0" w:sz="0" w:val="nil"/>
-                <w:left w:space="0" w:sz="0" w:val="nil"/>
-                <w:bottom w:space="0" w:sz="0" w:val="nil"/>
-                <w:right w:space="0" w:sz="0" w:val="nil"/>
-                <w:between w:space="0" w:sz="0" w:val="nil"/>
-              </w:pBdr>
-              <w:shd w:fill="auto" w:val="clear"/>
-              <w:tabs>
-                <w:tab w:val="left" w:leader="none" w:pos="454"/>
-              </w:tabs>
-              <w:spacing w:after="160" w:before="0" w:line="259" w:lineRule="auto"/>
-              <w:ind w:left="454" w:right="0" w:hanging="283"/>
-              <w:jc w:val="both"/>
-              <w:rPr>
-                <w:b w:val="0"/>
-                <w:bCs w:val="0"/>
-                <w:i w:val="0"/>
-                <w:iCs w:val="0"/>
-                <w:smallCaps w:val="0"/>
-                <w:strike w:val="0"/>
-                <w:color w:val="767171"/>
-                <w:sz w:val="24"/>
-                <w:szCs w:val="24"/>
-                <w:u w:val="none"/>
-                <w:shd w:fill="auto" w:val="clear"/>
-                <w:vertAlign w:val="baseline"/>
-              </w:rPr>
-            </w:pPr>
-            <w:r>
-              <w:rPr>
-                <w:rFonts w:ascii="Calibri" w:cs="Calibri" w:eastAsia="Calibri" w:hAnsi="Calibri"/>
-                <w:b w:val="0"/>
-                <w:bCs w:val="0"/>
-                <w:i w:val="0"/>
-                <w:iCs w:val="0"/>
-                <w:smallCaps w:val="0"/>
-                <w:strike w:val="0"/>
-                <w:color w:val="000000"/>
-                <w:sz w:val="24"/>
-                <w:szCs w:val="24"/>
-                <w:u w:val="none"/>
-                <w:shd w:fill="auto" w:val="clear"/>
-                <w:vertAlign w:val="baseline"/>
-                <w:rtl w:val="0"/>
-              </w:rPr>
-              <w:t xml:space="preserve">¿Cuáles son tus principales intereses profesionales? ¿Hay alguna área de desempeño que te interese más?</w:t>
-            </w:r>
-            <w:r>
-              <w:rPr>
-                <w:rtl w:val="0"/>
-              </w:rPr>
-            </w:r>
-          </w:p>
-          <w:p>
-            <w:pPr>
-              <w:tabs>
-                <w:tab w:val="left" w:leader="none" w:pos="454"/>
-              </w:tabs>
-              <w:jc w:val="both"/>
-              <w:rPr>
-                <w:color w:val="767171"/>
-                <w:sz w:val="24"/>
-                <w:szCs w:val="24"/>
-              </w:rPr>
-            </w:pPr>
-            <w:r>
-              <w:rPr>
-                <w:rtl w:val="0"/>
-              </w:rPr>
-            </w:r>
-          </w:p>
-          <w:p>
-            <w:pPr>
-              <w:tabs>
-                <w:tab w:val="left" w:leader="none" w:pos="454"/>
-              </w:tabs>
-              <w:jc w:val="both"/>
-              <w:rPr>
-                <w:color w:val="767171"/>
-                <w:sz w:val="24"/>
-                <w:szCs w:val="24"/>
-              </w:rPr>
-            </w:pPr>
-            <w:r>
-              <w:rPr>
-                <w:rtl w:val="0"/>
-              </w:rPr>
-            </w:r>
-          </w:p>
-          <w:p>
-            <w:pPr>
-              <w:tabs>
-                <w:tab w:val="left" w:leader="none" w:pos="454"/>
-              </w:tabs>
-              <w:jc w:val="both"/>
-              <w:rPr>
-                <w:color w:val="767171"/>
-                <w:sz w:val="24"/>
-                <w:szCs w:val="24"/>
-              </w:rPr>
-            </w:pPr>
-            <w:r>
-              <w:rPr>
-                <w:rtl w:val="0"/>
-              </w:rPr>
-            </w:r>
-          </w:p>
-          <w:p>
-            <w:pPr>
-              <w:tabs>
-                <w:tab w:val="left" w:leader="none" w:pos="454"/>
-              </w:tabs>
-              <w:jc w:val="both"/>
-              <w:rPr>
-                <w:color w:val="767171"/>
-                <w:sz w:val="24"/>
-                <w:szCs w:val="24"/>
-              </w:rPr>
-            </w:pPr>
-            <w:r>
-              <w:rPr>
-                <w:rtl w:val="0"/>
-              </w:rPr>
-            </w:r>
-          </w:p>
-          <w:p>
-            <w:pPr>
-              <w:tabs>
-                <w:tab w:val="left" w:leader="none" w:pos="454"/>
-              </w:tabs>
-              <w:jc w:val="both"/>
-              <w:rPr>
-                <w:color w:val="767171"/>
-                <w:sz w:val="24"/>
-                <w:szCs w:val="24"/>
-              </w:rPr>
-            </w:pPr>
-            <w:r>
-              <w:rPr>
-                <w:rtl w:val="0"/>
-              </w:rPr>
-            </w:r>
-          </w:p>
-          <w:p>
-            <w:pPr>
-              <w:tabs>
-                <w:tab w:val="left" w:leader="none" w:pos="454"/>
-              </w:tabs>
-              <w:jc w:val="both"/>
-              <w:rPr>
-                <w:color w:val="767171"/>
-                <w:sz w:val="24"/>
-                <w:szCs w:val="24"/>
-              </w:rPr>
-            </w:pPr>
-            <w:r>
-              <w:rPr>
-                <w:rtl w:val="0"/>
-              </w:rPr>
-            </w:r>
-          </w:p>
-          <w:p>
-            <w:pPr>
-              <w:tabs>
-                <w:tab w:val="left" w:leader="none" w:pos="454"/>
-              </w:tabs>
-              <w:jc w:val="both"/>
-              <w:rPr>
-                <w:color w:val="767171"/>
-                <w:sz w:val="24"/>
-                <w:szCs w:val="24"/>
-              </w:rPr>
-            </w:pPr>
-            <w:r>
-              <w:rPr>
-                <w:rtl w:val="0"/>
-              </w:rPr>
-            </w:r>
-          </w:p>
-          <w:p>
-            <w:pPr>
-              <w:keepNext w:val="0"/>
-              <w:keepLines w:val="0"/>
-              <w:pageBreakBefore w:val="0"/>
-              <w:widowControl w:val="1"/>
-              <w:numPr>
-                <w:ilvl w:val="0"/>
-                <w:numId w:val="1"/>
-              </w:numPr>
-              <w:pBdr>
-                <w:top w:space="0" w:sz="0" w:val="nil"/>
-                <w:left w:space="0" w:sz="0" w:val="nil"/>
-                <w:bottom w:space="0" w:sz="0" w:val="nil"/>
-                <w:right w:space="0" w:sz="0" w:val="nil"/>
-                <w:between w:space="0" w:sz="0" w:val="nil"/>
-              </w:pBdr>
-              <w:shd w:fill="auto" w:val="clear"/>
-              <w:tabs>
-                <w:tab w:val="left" w:leader="none" w:pos="454"/>
-              </w:tabs>
-              <w:spacing w:after="160" w:before="0" w:line="259" w:lineRule="auto"/>
-              <w:ind w:left="454" w:right="0" w:hanging="283"/>
-              <w:jc w:val="both"/>
-              <w:rPr>
-                <w:b w:val="0"/>
-                <w:bCs w:val="0"/>
-                <w:i w:val="0"/>
-                <w:iCs w:val="0"/>
-                <w:smallCaps w:val="0"/>
-                <w:strike w:val="0"/>
-                <w:color w:val="767171"/>
-                <w:sz w:val="24"/>
-                <w:szCs w:val="24"/>
-                <w:u w:val="none"/>
-                <w:shd w:fill="auto" w:val="clear"/>
-                <w:vertAlign w:val="baseline"/>
-              </w:rPr>
-            </w:pPr>
-            <w:r>
-              <w:rPr>
-                <w:rFonts w:ascii="Calibri" w:cs="Calibri" w:eastAsia="Calibri" w:hAnsi="Calibri"/>
-                <w:b w:val="0"/>
-                <w:bCs w:val="0"/>
-                <w:i w:val="0"/>
-                <w:iCs w:val="0"/>
-                <w:smallCaps w:val="0"/>
-                <w:strike w:val="0"/>
-                <w:color w:val="000000"/>
-                <w:sz w:val="24"/>
-                <w:szCs w:val="24"/>
-                <w:u w:val="none"/>
-                <w:shd w:fill="auto" w:val="clear"/>
-                <w:vertAlign w:val="baseline"/>
-                <w:rtl w:val="0"/>
-              </w:rPr>
-              <w:t xml:space="preserve">¿Cuáles son las principales competencias que se relacionan con tus intereses profesionales? ¿Hay alguna de ellas que sientas que requieres especialmente fortalecer?</w:t>
-            </w:r>
-            <w:r>
-              <w:rPr>
-                <w:rtl w:val="0"/>
-              </w:rPr>
-            </w:r>
-          </w:p>
-          <w:p>
-            <w:pPr>
-              <w:tabs>
-                <w:tab w:val="left" w:leader="none" w:pos="454"/>
-              </w:tabs>
-              <w:jc w:val="both"/>
-              <w:rPr>
-                <w:color w:val="767171"/>
-                <w:sz w:val="24"/>
-                <w:szCs w:val="24"/>
-              </w:rPr>
-            </w:pPr>
-            <w:r>
-              <w:rPr>
-                <w:rtl w:val="0"/>
-              </w:rPr>
-            </w:r>
-          </w:p>
-          <w:p>
-            <w:pPr>
-              <w:tabs>
-                <w:tab w:val="left" w:leader="none" w:pos="454"/>
-              </w:tabs>
-              <w:jc w:val="both"/>
-              <w:rPr>
-                <w:color w:val="767171"/>
-                <w:sz w:val="24"/>
-                <w:szCs w:val="24"/>
-              </w:rPr>
-            </w:pPr>
-            <w:r>
-              <w:rPr>
-                <w:rtl w:val="0"/>
-              </w:rPr>
-            </w:r>
-          </w:p>
-          <w:p>
-            <w:pPr>
-              <w:tabs>
-                <w:tab w:val="left" w:leader="none" w:pos="454"/>
-              </w:tabs>
-              <w:jc w:val="both"/>
-              <w:rPr>
-                <w:color w:val="767171"/>
-                <w:sz w:val="24"/>
-                <w:szCs w:val="24"/>
-              </w:rPr>
-            </w:pPr>
-            <w:r>
-              <w:rPr>
-                <w:rtl w:val="0"/>
-              </w:rPr>
-            </w:r>
-          </w:p>
-          <w:p>
-            <w:pPr>
-              <w:tabs>
-                <w:tab w:val="left" w:leader="none" w:pos="454"/>
-              </w:tabs>
-              <w:jc w:val="both"/>
-              <w:rPr>
-                <w:color w:val="767171"/>
-                <w:sz w:val="24"/>
-                <w:szCs w:val="24"/>
-              </w:rPr>
-            </w:pPr>
-            <w:r>
-              <w:rPr>
-                <w:rtl w:val="0"/>
-              </w:rPr>
-            </w:r>
-          </w:p>
-          <w:p>
-            <w:pPr>
-              <w:tabs>
-                <w:tab w:val="left" w:leader="none" w:pos="454"/>
-              </w:tabs>
-              <w:jc w:val="both"/>
-              <w:rPr>
-                <w:color w:val="767171"/>
-                <w:sz w:val="24"/>
-                <w:szCs w:val="24"/>
-              </w:rPr>
-            </w:pPr>
-            <w:r>
-              <w:rPr>
-                <w:rtl w:val="0"/>
-              </w:rPr>
-            </w:r>
-          </w:p>
-          <w:p>
-            <w:pPr>
-              <w:tabs>
-                <w:tab w:val="left" w:leader="none" w:pos="454"/>
-              </w:tabs>
-              <w:jc w:val="both"/>
-              <w:rPr>
-                <w:color w:val="767171"/>
-                <w:sz w:val="24"/>
-                <w:szCs w:val="24"/>
-              </w:rPr>
-            </w:pPr>
-            <w:r>
-              <w:rPr>
-                <w:rtl w:val="0"/>
-              </w:rPr>
-            </w:r>
-          </w:p>
-          <w:p>
-            <w:pPr>
-              <w:tabs>
-                <w:tab w:val="left" w:leader="none" w:pos="454"/>
-              </w:tabs>
-              <w:jc w:val="both"/>
-              <w:rPr>
-                <w:color w:val="767171"/>
-                <w:sz w:val="24"/>
-                <w:szCs w:val="24"/>
-              </w:rPr>
-            </w:pPr>
-            <w:r>
-              <w:rPr>
-                <w:rtl w:val="0"/>
-              </w:rPr>
-            </w:r>
-          </w:p>
-          <w:p>
-            <w:pPr>
-              <w:tabs>
-                <w:tab w:val="left" w:leader="none" w:pos="454"/>
-              </w:tabs>
-              <w:jc w:val="both"/>
-              <w:rPr>
-                <w:color w:val="767171"/>
-                <w:sz w:val="24"/>
-                <w:szCs w:val="24"/>
-              </w:rPr>
-            </w:pPr>
-            <w:r>
-              <w:rPr>
-                <w:rtl w:val="0"/>
-              </w:rPr>
-            </w:r>
-          </w:p>
-          <w:p>
-            <w:pPr>
-              <w:keepNext w:val="0"/>
-              <w:keepLines w:val="0"/>
-              <w:pageBreakBefore w:val="0"/>
-              <w:widowControl w:val="1"/>
-              <w:numPr>
-                <w:ilvl w:val="0"/>
-                <w:numId w:val="1"/>
-              </w:numPr>
-              <w:pBdr>
-                <w:top w:space="0" w:sz="0" w:val="nil"/>
-                <w:left w:space="0" w:sz="0" w:val="nil"/>
-                <w:bottom w:space="0" w:sz="0" w:val="nil"/>
-                <w:right w:space="0" w:sz="0" w:val="nil"/>
-                <w:between w:space="0" w:sz="0" w:val="nil"/>
-              </w:pBdr>
-              <w:shd w:fill="auto" w:val="clear"/>
-              <w:tabs>
-                <w:tab w:val="left" w:leader="none" w:pos="454"/>
-              </w:tabs>
-              <w:spacing w:after="160" w:before="0" w:line="259" w:lineRule="auto"/>
-              <w:ind w:left="454" w:right="0" w:hanging="283"/>
-              <w:jc w:val="both"/>
-              <w:rPr>
-                <w:b w:val="0"/>
-                <w:bCs w:val="0"/>
-                <w:i w:val="0"/>
-                <w:iCs w:val="0"/>
-                <w:smallCaps w:val="0"/>
-                <w:strike w:val="0"/>
-                <w:color w:val="767171"/>
-                <w:sz w:val="24"/>
-                <w:szCs w:val="24"/>
-                <w:u w:val="none"/>
-                <w:shd w:fill="auto" w:val="clear"/>
-                <w:vertAlign w:val="baseline"/>
-              </w:rPr>
-            </w:pPr>
-            <w:r>
-              <w:rPr>
-                <w:rFonts w:ascii="Calibri" w:cs="Calibri" w:eastAsia="Calibri" w:hAnsi="Calibri"/>
-                <w:b w:val="0"/>
-                <w:bCs w:val="0"/>
-                <w:i w:val="0"/>
-                <w:iCs w:val="0"/>
-                <w:smallCaps w:val="0"/>
-                <w:strike w:val="0"/>
-                <w:color w:val="000000"/>
-                <w:sz w:val="24"/>
-                <w:szCs w:val="24"/>
-                <w:u w:val="none"/>
-                <w:shd w:fill="auto" w:val="clear"/>
-                <w:vertAlign w:val="baseline"/>
-                <w:rtl w:val="0"/>
-              </w:rPr>
-              <w:t xml:space="preserve">¿Cómo te gustaría que fuera tu escenario laboral en 5 años más? ¿Qué te gustaría estar haciendo?</w:t>
-            </w:r>
-            <w:r>
-              <w:rPr>
-                <w:rtl w:val="0"/>
-              </w:rPr>
-            </w:r>
-          </w:p>
-          <w:p>
-            <w:pPr>
-              <w:tabs>
-                <w:tab w:val="left" w:leader="none" w:pos="454"/>
-              </w:tabs>
-              <w:jc w:val="both"/>
-              <w:rPr>
-                <w:color w:val="767171"/>
-                <w:sz w:val="24"/>
-                <w:szCs w:val="24"/>
-              </w:rPr>
-            </w:pPr>
-            <w:r>
-              <w:rPr>
-                <w:rtl w:val="0"/>
-              </w:rPr>
-            </w:r>
-          </w:p>
-          <w:p>
-            <w:pPr>
-              <w:tabs>
-                <w:tab w:val="left" w:leader="none" w:pos="454"/>
-              </w:tabs>
-              <w:jc w:val="both"/>
-              <w:rPr>
-                <w:color w:val="767171"/>
-                <w:sz w:val="24"/>
-                <w:szCs w:val="24"/>
-              </w:rPr>
-            </w:pPr>
-            <w:r>
-              <w:rPr>
-                <w:rtl w:val="0"/>
-              </w:rPr>
-            </w:r>
-          </w:p>
-          <w:p>
-            <w:pPr>
-              <w:tabs>
-                <w:tab w:val="left" w:leader="none" w:pos="454"/>
-              </w:tabs>
-              <w:jc w:val="both"/>
-              <w:rPr>
-                <w:color w:val="767171"/>
-                <w:sz w:val="24"/>
-                <w:szCs w:val="24"/>
-              </w:rPr>
-            </w:pPr>
-            <w:r>
-              <w:rPr>
-                <w:rtl w:val="0"/>
-              </w:rPr>
-            </w:r>
-          </w:p>
-          <w:p>
-            <w:pPr>
-              <w:jc w:val="both"/>
-              <w:rPr>
-                <w:rFonts w:ascii="Calibri" w:cs="Calibri" w:eastAsia="Calibri" w:hAnsi="Calibri"/>
-                <w:b w:val="1"/>
-                <w:bCs w:val="1"/>
-                <w:color w:val="1f4e79"/>
-              </w:rPr>
-            </w:pPr>
-            <w:r>
-              <w:rPr>
-                <w:rtl w:val="0"/>
-              </w:rPr>
-            </w:r>
-          </w:p>
-          <w:p>
-            <w:pPr>
-              <w:jc w:val="both"/>
-              <w:rPr>
-                <w:rFonts w:ascii="Calibri" w:cs="Calibri" w:eastAsia="Calibri" w:hAnsi="Calibri"/>
-                <w:b w:val="1"/>
-                <w:bCs w:val="1"/>
-                <w:color w:val="1f4e79"/>
-              </w:rPr>
-            </w:pPr>
-            <w:r>
-              <w:rPr>
-                <w:rtl w:val="0"/>
-              </w:rPr>
-            </w:r>
-          </w:p>
-          <w:p>
-            <w:pPr>
-              <w:jc w:val="both"/>
-              <w:rPr>
-                <w:rFonts w:ascii="Calibri" w:cs="Calibri" w:eastAsia="Calibri" w:hAnsi="Calibri"/>
-                <w:b w:val="1"/>
-                <w:bCs w:val="1"/>
-                <w:color w:val="1f4e79"/>
-              </w:rPr>
-            </w:pPr>
-            <w:r>
-              <w:rPr>
-                <w:rtl w:val="0"/>
-              </w:rPr>
-            </w:r>
-          </w:p>
-          <w:p>
-            <w:pPr>
-              <w:jc w:val="both"/>
-              <w:rPr>
-                <w:rFonts w:ascii="Calibri" w:cs="Calibri" w:eastAsia="Calibri" w:hAnsi="Calibri"/>
-                <w:b w:val="1"/>
-                <w:bCs w:val="1"/>
-                <w:color w:val="1f4e79"/>
-              </w:rPr>
-            </w:pPr>
-            <w:r>
-              <w:rPr>
-                <w:rtl w:val="0"/>
-              </w:rPr>
-            </w:r>
-          </w:p>
-          <w:p>
-            <w:pPr>
-              <w:jc w:val="both"/>
-              <w:rPr>
-                <w:rFonts w:ascii="Calibri" w:cs="Calibri" w:eastAsia="Calibri" w:hAnsi="Calibri"/>
-                <w:b w:val="1"/>
-                <w:bCs w:val="1"/>
-                <w:color w:val="1f4e79"/>
-              </w:rPr>
-            </w:pPr>
-            <w:r>
-              <w:rPr>
-                <w:rtl w:val="0"/>
-              </w:rPr>
-            </w:r>
-          </w:p>
-          <w:p>
-            <w:pPr>
-              <w:jc w:val="both"/>
-              <w:rPr>
-                <w:rFonts w:ascii="Calibri" w:cs="Calibri" w:eastAsia="Calibri" w:hAnsi="Calibri"/>
-                <w:b w:val="1"/>
-                <w:bCs w:val="1"/>
-                <w:color w:val="1f4e79"/>
-              </w:rPr>
-            </w:pPr>
-            <w:r>
-              <w:rPr>
-                <w:rtl w:val="0"/>
-              </w:rPr>
-            </w:r>
-          </w:p>
-          <w:p>
-            <w:pPr>
-              <w:jc w:val="both"/>
-              <w:rPr>
-                <w:rFonts w:ascii="Calibri" w:cs="Calibri" w:eastAsia="Calibri" w:hAnsi="Calibri"/>
-                <w:b w:val="1"/>
-                <w:bCs w:val="1"/>
-                <w:color w:val="1f4e79"/>
-              </w:rPr>
-            </w:pPr>
-            <w:r>
-              <w:rPr>
-                <w:rtl w:val="0"/>
-              </w:rPr>
-            </w:r>
-          </w:p>
-          <w:p>
-            <w:pPr>
-              <w:jc w:val="both"/>
-              <w:rPr>
-                <w:rFonts w:ascii="Calibri" w:cs="Calibri" w:eastAsia="Calibri" w:hAnsi="Calibri"/>
-                <w:b w:val="1"/>
-                <w:bCs w:val="1"/>
-                <w:color w:val="1f4e79"/>
-              </w:rPr>
-            </w:pPr>
-            <w:r>
-              <w:rPr>
-                <w:rtl w:val="0"/>
-              </w:rPr>
-            </w:r>
-          </w:p>
-          <w:p>
-            <w:pPr>
-              <w:jc w:val="both"/>
-              <w:rPr>
-                <w:rFonts w:ascii="Calibri" w:cs="Calibri" w:eastAsia="Calibri" w:hAnsi="Calibri"/>
-                <w:b w:val="1"/>
-                <w:bCs w:val="1"/>
-                <w:color w:val="1f4e79"/>
-              </w:rPr>
-            </w:pPr>
-            <w:r>
-              <w:rPr>
-                <w:rtl w:val="0"/>
-              </w:rPr>
-            </w:r>
-          </w:p>
-          <w:p>
-            <w:pPr>
-              <w:jc w:val="both"/>
-              <w:rPr>
-                <w:rFonts w:ascii="Calibri" w:cs="Calibri" w:eastAsia="Calibri" w:hAnsi="Calibri"/>
-                <w:b w:val="1"/>
-                <w:bCs w:val="1"/>
-                <w:color w:val="1f4e79"/>
-              </w:rPr>
-            </w:pPr>
-            <w:r>
-              <w:rPr>
-                <w:rtl w:val="0"/>
-              </w:rPr>
-            </w:r>
-          </w:p>
-        </w:tc>
-      </w:tr>
-    </w:tbl>
-    <w:p>
-      <w:pPr>
-        <w:spacing w:after="0" w:line="360" w:lineRule="auto"/>
-        <w:jc w:val="both"/>
-        <w:rPr>
-          <w:color w:val="595959"/>
-          <w:sz w:val="24"/>
-          <w:szCs w:val="24"/>
-        </w:rPr>
-      </w:pPr>
-      <w:r>
-        <w:rPr>
-          <w:rtl w:val="0"/>
-        </w:rPr>
-      </w:r>
-    </w:p>
-    <w:p>
-      <w:pPr>
-        <w:spacing w:after="0" w:line="360" w:lineRule="auto"/>
-        <w:jc w:val="both"/>
-        <w:rPr>
-          <w:b w:val="1"/>
-          <w:bCs w:val="1"/>
-          <w:sz w:val="24"/>
-          <w:szCs w:val="24"/>
-        </w:rPr>
-      </w:pPr>
-      <w:r>
-        <w:rPr>
-          <w:rtl w:val="0"/>
-        </w:rPr>
-      </w:r>
-    </w:p>
-    <w:p>
-      <w:pPr>
-        <w:spacing w:after="0" w:line="360" w:lineRule="auto"/>
-        <w:jc w:val="both"/>
-        <w:rPr>
-          <w:b w:val="1"/>
-          <w:bCs w:val="1"/>
-          <w:sz w:val="24"/>
-          <w:szCs w:val="24"/>
-        </w:rPr>
-      </w:pPr>
-      <w:r>
-        <w:rPr>
-          <w:rtl w:val="0"/>
-        </w:rPr>
-      </w:r>
-    </w:p>
-    <w:tbl>
-      <w:tblPr>
         <w:tblStyle w:val="Table6"/>
         <w:tblW w:w="10076.0" w:type="dxa"/>
         <w:jc w:val="left"/>
@@ -2274,6 +1613,7 @@
           </w:tcPr>
           <w:p>
             <w:pPr>
+              <w:spacing w:after="200" w:before="200" w:lineRule="auto"/>
               <w:jc w:val="both"/>
               <w:rPr>
                 <w:rFonts w:ascii="Century Gothic" w:cs="Century Gothic" w:eastAsia="Century Gothic" w:hAnsi="Century Gothic"/>
@@ -2393,17 +1733,22 @@
               <w:tabs>
                 <w:tab w:val="left" w:leader="none" w:pos="454"/>
               </w:tabs>
+              <w:spacing w:after="240" w:before="240" w:lineRule="auto"/>
               <w:jc w:val="both"/>
               <w:rPr>
-                <w:color w:val="767171"/>
+                <w:color w:val="434343"/>
                 <w:sz w:val="24"/>
                 <w:szCs w:val="24"/>
               </w:rPr>
             </w:pPr>
             <w:r>
               <w:rPr>
-                <w:rtl w:val="0"/>
-              </w:rPr>
+                <w:color w:val="434343"/>
+                <w:sz w:val="24"/>
+                <w:szCs w:val="24"/>
+                <w:rtl w:val="0"/>
+              </w:rPr>
+              <w:t xml:space="preserve">Los proyectos APT anteriores se relacionaban principalmente con el desarrollo de aplicaciones móviles, por lo que sí tenían relación con mi carrera. Pero, el proyecto actual de sistema de gestión de inventario se relaciona más con mis intereses profesionales, ya que combina desarrollo web y móvil, bases de datos, análisis de requerimientos y gestión de información.</w:t>
             </w:r>
           </w:p>
           <w:p>
@@ -2411,17 +1756,22 @@
               <w:tabs>
                 <w:tab w:val="left" w:leader="none" w:pos="454"/>
               </w:tabs>
+              <w:spacing w:after="240" w:before="240" w:lineRule="auto"/>
               <w:jc w:val="both"/>
               <w:rPr>
-                <w:color w:val="767171"/>
+                <w:color w:val="434343"/>
                 <w:sz w:val="24"/>
                 <w:szCs w:val="24"/>
               </w:rPr>
             </w:pPr>
             <w:r>
               <w:rPr>
-                <w:rtl w:val="0"/>
-              </w:rPr>
+                <w:color w:val="434343"/>
+                <w:sz w:val="24"/>
+                <w:szCs w:val="24"/>
+                <w:rtl w:val="0"/>
+              </w:rPr>
+              <w:t xml:space="preserve">Considero que el proyecto sí tuvo un ajuste, pasando de una aplicación móvil enfocada en un problema específico a una solución más completa, compuesta por una aplicación para escanear productos y una plataforma web para gestionar el inventario y visualizar información mediante un dashboard.</w:t>
             </w:r>
           </w:p>
           <w:p>
@@ -2429,6 +1779,7 @@
               <w:tabs>
                 <w:tab w:val="left" w:leader="none" w:pos="454"/>
               </w:tabs>
+              <w:spacing w:after="240" w:before="240" w:lineRule="auto"/>
               <w:jc w:val="both"/>
               <w:rPr>
                 <w:color w:val="767171"/>
@@ -2438,108 +1789,13 @@
             </w:pPr>
             <w:r>
               <w:rPr>
-                <w:rtl w:val="0"/>
-              </w:rPr>
-            </w:r>
-          </w:p>
-          <w:p>
-            <w:pPr>
-              <w:tabs>
-                <w:tab w:val="left" w:leader="none" w:pos="454"/>
-              </w:tabs>
-              <w:jc w:val="both"/>
-              <w:rPr>
-                <w:color w:val="767171"/>
-                <w:sz w:val="24"/>
-                <w:szCs w:val="24"/>
-              </w:rPr>
-            </w:pPr>
-            <w:r>
-              <w:rPr>
-                <w:rtl w:val="0"/>
-              </w:rPr>
-            </w:r>
-          </w:p>
-          <w:p>
-            <w:pPr>
-              <w:tabs>
-                <w:tab w:val="left" w:leader="none" w:pos="454"/>
-              </w:tabs>
-              <w:jc w:val="both"/>
-              <w:rPr>
-                <w:sz w:val="24"/>
-                <w:szCs w:val="24"/>
-              </w:rPr>
-            </w:pPr>
-            <w:r>
-              <w:rPr>
-                <w:rtl w:val="0"/>
-              </w:rPr>
-            </w:r>
-          </w:p>
-          <w:p>
-            <w:pPr>
-              <w:tabs>
-                <w:tab w:val="left" w:leader="none" w:pos="454"/>
-              </w:tabs>
-              <w:jc w:val="both"/>
-              <w:rPr>
-                <w:sz w:val="24"/>
-                <w:szCs w:val="24"/>
-              </w:rPr>
-            </w:pPr>
-            <w:r>
-              <w:rPr>
-                <w:rtl w:val="0"/>
-              </w:rPr>
-            </w:r>
-          </w:p>
-          <w:p>
-            <w:pPr>
-              <w:tabs>
-                <w:tab w:val="left" w:leader="none" w:pos="454"/>
-              </w:tabs>
-              <w:jc w:val="both"/>
-              <w:rPr>
-                <w:sz w:val="24"/>
-                <w:szCs w:val="24"/>
-              </w:rPr>
-            </w:pPr>
-            <w:r>
-              <w:rPr>
-                <w:rtl w:val="0"/>
-              </w:rPr>
-            </w:r>
-          </w:p>
-          <w:p>
-            <w:pPr>
-              <w:tabs>
-                <w:tab w:val="left" w:leader="none" w:pos="454"/>
-              </w:tabs>
-              <w:jc w:val="both"/>
-              <w:rPr>
-                <w:sz w:val="24"/>
-                <w:szCs w:val="24"/>
-              </w:rPr>
-            </w:pPr>
-            <w:r>
-              <w:rPr>
-                <w:rtl w:val="0"/>
-              </w:rPr>
-            </w:r>
-          </w:p>
-          <w:p>
-            <w:pPr>
-              <w:tabs>
-                <w:tab w:val="left" w:leader="none" w:pos="454"/>
-              </w:tabs>
-              <w:jc w:val="both"/>
-              <w:rPr>
-                <w:color w:val="767171"/>
-                <w:sz w:val="24"/>
-                <w:szCs w:val="24"/>
-              </w:rPr>
-            </w:pPr>
+                <w:color w:val="434343"/>
+                <w:sz w:val="24"/>
+                <w:szCs w:val="24"/>
+                <w:rtl w:val="0"/>
+              </w:rPr>
+              <w:t xml:space="preserve">Este proyecto permitirá fortalecer competencias de desarrollo de software, bases de datos, aplicaciones móviles y análisis de información, dentro de un contexto real de gestión de inventario de un minimarket.</w:t>
+            </w:r>
             <w:r>
               <w:rPr>
                 <w:rtl w:val="0"/>
@@ -2796,192 +2052,6 @@
               </w:rPr>
               <w:t xml:space="preserve">¿En qué contexto se debería situar este Proyecto APT?  </w:t>
             </w:r>
-            <w:r>
-              <w:rPr>
-                <w:rtl w:val="0"/>
-              </w:rPr>
-            </w:r>
-          </w:p>
-          <w:p>
-            <w:pPr>
-              <w:tabs>
-                <w:tab w:val="left" w:leader="none" w:pos="1021"/>
-              </w:tabs>
-              <w:ind w:firstLine="142"/>
-              <w:jc w:val="both"/>
-              <w:rPr>
-                <w:rFonts w:ascii="Calibri" w:cs="Calibri" w:eastAsia="Calibri" w:hAnsi="Calibri"/>
-                <w:b w:val="1"/>
-                <w:bCs w:val="1"/>
-                <w:color w:val="1f4e79"/>
-              </w:rPr>
-            </w:pPr>
-            <w:r>
-              <w:rPr>
-                <w:rtl w:val="0"/>
-              </w:rPr>
-            </w:r>
-          </w:p>
-          <w:p>
-            <w:pPr>
-              <w:jc w:val="both"/>
-              <w:rPr>
-                <w:rFonts w:ascii="Calibri" w:cs="Calibri" w:eastAsia="Calibri" w:hAnsi="Calibri"/>
-                <w:b w:val="1"/>
-                <w:bCs w:val="1"/>
-                <w:color w:val="1f4e79"/>
-              </w:rPr>
-            </w:pPr>
-            <w:r>
-              <w:rPr>
-                <w:rtl w:val="0"/>
-              </w:rPr>
-            </w:r>
-          </w:p>
-          <w:p>
-            <w:pPr>
-              <w:jc w:val="both"/>
-              <w:rPr>
-                <w:rFonts w:ascii="Calibri" w:cs="Calibri" w:eastAsia="Calibri" w:hAnsi="Calibri"/>
-                <w:b w:val="1"/>
-                <w:bCs w:val="1"/>
-              </w:rPr>
-            </w:pPr>
-            <w:r>
-              <w:rPr>
-                <w:rtl w:val="0"/>
-              </w:rPr>
-            </w:r>
-          </w:p>
-          <w:p>
-            <w:pPr>
-              <w:jc w:val="both"/>
-              <w:rPr>
-                <w:rFonts w:ascii="Calibri" w:cs="Calibri" w:eastAsia="Calibri" w:hAnsi="Calibri"/>
-                <w:b w:val="1"/>
-                <w:bCs w:val="1"/>
-              </w:rPr>
-            </w:pPr>
-            <w:r>
-              <w:rPr>
-                <w:rtl w:val="0"/>
-              </w:rPr>
-            </w:r>
-          </w:p>
-          <w:p>
-            <w:pPr>
-              <w:jc w:val="both"/>
-              <w:rPr>
-                <w:rFonts w:ascii="Calibri" w:cs="Calibri" w:eastAsia="Calibri" w:hAnsi="Calibri"/>
-                <w:b w:val="1"/>
-                <w:bCs w:val="1"/>
-              </w:rPr>
-            </w:pPr>
-            <w:r>
-              <w:rPr>
-                <w:rtl w:val="0"/>
-              </w:rPr>
-            </w:r>
-          </w:p>
-          <w:p>
-            <w:pPr>
-              <w:jc w:val="both"/>
-              <w:rPr>
-                <w:rFonts w:ascii="Calibri" w:cs="Calibri" w:eastAsia="Calibri" w:hAnsi="Calibri"/>
-                <w:b w:val="1"/>
-                <w:bCs w:val="1"/>
-              </w:rPr>
-            </w:pPr>
-            <w:r>
-              <w:rPr>
-                <w:rtl w:val="0"/>
-              </w:rPr>
-            </w:r>
-          </w:p>
-          <w:p>
-            <w:pPr>
-              <w:jc w:val="both"/>
-              <w:rPr>
-                <w:rFonts w:ascii="Calibri" w:cs="Calibri" w:eastAsia="Calibri" w:hAnsi="Calibri"/>
-                <w:b w:val="1"/>
-                <w:bCs w:val="1"/>
-              </w:rPr>
-            </w:pPr>
-            <w:r>
-              <w:rPr>
-                <w:rtl w:val="0"/>
-              </w:rPr>
-            </w:r>
-          </w:p>
-          <w:p>
-            <w:pPr>
-              <w:jc w:val="both"/>
-              <w:rPr>
-                <w:rFonts w:ascii="Calibri" w:cs="Calibri" w:eastAsia="Calibri" w:hAnsi="Calibri"/>
-                <w:b w:val="1"/>
-                <w:bCs w:val="1"/>
-              </w:rPr>
-            </w:pPr>
-            <w:r>
-              <w:rPr>
-                <w:rtl w:val="0"/>
-              </w:rPr>
-            </w:r>
-          </w:p>
-          <w:p>
-            <w:pPr>
-              <w:jc w:val="both"/>
-              <w:rPr>
-                <w:rFonts w:ascii="Calibri" w:cs="Calibri" w:eastAsia="Calibri" w:hAnsi="Calibri"/>
-                <w:b w:val="1"/>
-                <w:bCs w:val="1"/>
-              </w:rPr>
-            </w:pPr>
-            <w:r>
-              <w:rPr>
-                <w:rtl w:val="0"/>
-              </w:rPr>
-            </w:r>
-          </w:p>
-          <w:p>
-            <w:pPr>
-              <w:jc w:val="both"/>
-              <w:rPr>
-                <w:rFonts w:ascii="Calibri" w:cs="Calibri" w:eastAsia="Calibri" w:hAnsi="Calibri"/>
-                <w:b w:val="1"/>
-                <w:bCs w:val="1"/>
-              </w:rPr>
-            </w:pPr>
-            <w:r>
-              <w:rPr>
-                <w:rtl w:val="0"/>
-              </w:rPr>
-            </w:r>
-          </w:p>
-          <w:p>
-            <w:pPr>
-              <w:jc w:val="both"/>
-              <w:rPr>
-                <w:rFonts w:ascii="Calibri" w:cs="Calibri" w:eastAsia="Calibri" w:hAnsi="Calibri"/>
-                <w:b w:val="1"/>
-                <w:bCs w:val="1"/>
-              </w:rPr>
-            </w:pPr>
-            <w:r>
-              <w:rPr>
-                <w:rtl w:val="0"/>
-              </w:rPr>
-            </w:r>
-          </w:p>
-          <w:p>
-            <w:pPr>
-              <w:jc w:val="both"/>
-              <w:rPr>
-                <w:rFonts w:ascii="Calibri" w:cs="Calibri" w:eastAsia="Calibri" w:hAnsi="Calibri"/>
-                <w:b w:val="1"/>
-                <w:bCs w:val="1"/>
-              </w:rPr>
-            </w:pPr>
             <w:r>
               <w:rPr>
                 <w:rtl w:val="0"/>
@@ -3487,12 +2557,12 @@
               <wp:inline distB="0" distT="0" distL="0" distR="0">
                 <wp:extent cx="1996440" cy="428625"/>
                 <wp:effectExtent b="0" l="0" r="0" t="0"/>
-                <wp:docPr descr="http://www.duoc.cl/normasgraficas/normasgraficas/marca-duoc/6logo-fondo-transparente/fondo-transparente.png" id="17582" name="image4.png"/>
+                <wp:docPr descr="http://www.duoc.cl/normasgraficas/normasgraficas/marca-duoc/6logo-fondo-transparente/fondo-transparente.png" id="17582" name="image2.png"/>
                 <a:graphic>
                   <a:graphicData uri="http://schemas.openxmlformats.org/drawingml/2006/picture">
                     <pic:pic>
                       <pic:nvPicPr>
-                        <pic:cNvPr descr="http://www.duoc.cl/normasgraficas/normasgraficas/marca-duoc/6logo-fondo-transparente/fondo-transparente.png" id="0" name="image4.png"/>
+                        <pic:cNvPr descr="http://www.duoc.cl/normasgraficas/normasgraficas/marca-duoc/6logo-fondo-transparente/fondo-transparente.png" id="0" name="image2.png"/>
                         <pic:cNvPicPr preferRelativeResize="0"/>
                       </pic:nvPicPr>
                       <pic:blipFill>
@@ -3678,12 +2748,12 @@
               <wp:inline distB="0" distT="0" distL="0" distR="0">
                 <wp:extent cx="363448" cy="578253"/>
                 <wp:effectExtent b="0" l="0" r="0" t="0"/>
-                <wp:docPr id="17581" name="image1.png"/>
+                <wp:docPr id="17581" name="image3.png"/>
                 <a:graphic>
                   <a:graphicData uri="http://schemas.openxmlformats.org/drawingml/2006/picture">
                     <pic:pic>
                       <pic:nvPicPr>
-                        <pic:cNvPr id="0" name="image1.png"/>
+                        <pic:cNvPr id="0" name="image3.png"/>
                         <pic:cNvPicPr preferRelativeResize="0"/>
                       </pic:nvPicPr>
                       <pic:blipFill>
@@ -3834,12 +2904,12 @@
               <wp:inline distB="0" distT="0" distL="0" distR="0">
                 <wp:extent cx="1908834" cy="470407"/>
                 <wp:effectExtent b="0" l="0" r="0" t="0"/>
-                <wp:docPr id="17583" name="image3.png"/>
+                <wp:docPr id="17583" name="image4.png"/>
                 <a:graphic>
                   <a:graphicData uri="http://schemas.openxmlformats.org/drawingml/2006/picture">
                     <pic:pic>
                       <pic:nvPicPr>
-                        <pic:cNvPr id="0" name="image3.png"/>
+                        <pic:cNvPr id="0" name="image4.png"/>
                         <pic:cNvPicPr preferRelativeResize="0"/>
                       </pic:nvPicPr>
                       <pic:blipFill>
@@ -4030,8 +3100,121 @@
       </w:rPr>
     </w:lvl>
   </w:abstractNum>
+  <w:abstractNum w:abstractNumId="2">
+    <w:lvl w:ilvl="0">
+      <w:start w:val="1"/>
+      <w:numFmt w:val="decimal"/>
+      <w:lvlText w:val="%1."/>
+      <w:lvlJc w:val="left"/>
+      <w:pPr>
+        <w:ind w:left="720" w:hanging="360"/>
+      </w:pPr>
+      <w:rPr>
+        <w:u w:val="none"/>
+      </w:rPr>
+    </w:lvl>
+    <w:lvl w:ilvl="1">
+      <w:start w:val="1"/>
+      <w:numFmt w:val="lowerLetter"/>
+      <w:lvlText w:val="%2."/>
+      <w:lvlJc w:val="left"/>
+      <w:pPr>
+        <w:ind w:left="1440" w:hanging="360"/>
+      </w:pPr>
+      <w:rPr>
+        <w:u w:val="none"/>
+      </w:rPr>
+    </w:lvl>
+    <w:lvl w:ilvl="2">
+      <w:start w:val="1"/>
+      <w:numFmt w:val="lowerRoman"/>
+      <w:lvlText w:val="%3."/>
+      <w:lvlJc w:val="right"/>
+      <w:pPr>
+        <w:ind w:left="2160" w:hanging="360"/>
+      </w:pPr>
+      <w:rPr>
+        <w:u w:val="none"/>
+      </w:rPr>
+    </w:lvl>
+    <w:lvl w:ilvl="3">
+      <w:start w:val="1"/>
+      <w:numFmt w:val="decimal"/>
+      <w:lvlText w:val="%4."/>
+      <w:lvlJc w:val="left"/>
+      <w:pPr>
+        <w:ind w:left="2880" w:hanging="360"/>
+      </w:pPr>
+      <w:rPr>
+        <w:u w:val="none"/>
+      </w:rPr>
+    </w:lvl>
+    <w:lvl w:ilvl="4">
+      <w:start w:val="1"/>
+      <w:numFmt w:val="lowerLetter"/>
+      <w:lvlText w:val="%5."/>
+      <w:lvlJc w:val="left"/>
+      <w:pPr>
+        <w:ind w:left="3600" w:hanging="360"/>
+      </w:pPr>
+      <w:rPr>
+        <w:u w:val="none"/>
+      </w:rPr>
+    </w:lvl>
+    <w:lvl w:ilvl="5">
+      <w:start w:val="1"/>
+      <w:numFmt w:val="lowerRoman"/>
+      <w:lvlText w:val="%6."/>
+      <w:lvlJc w:val="right"/>
+      <w:pPr>
+        <w:ind w:left="4320" w:hanging="360"/>
+      </w:pPr>
+      <w:rPr>
+        <w:u w:val="none"/>
+      </w:rPr>
+    </w:lvl>
+    <w:lvl w:ilvl="6">
+      <w:start w:val="1"/>
+      <w:numFmt w:val="decimal"/>
+      <w:lvlText w:val="%7."/>
+      <w:lvlJc w:val="left"/>
+      <w:pPr>
+        <w:ind w:left="5040" w:hanging="360"/>
+      </w:pPr>
+      <w:rPr>
+        <w:u w:val="none"/>
+      </w:rPr>
+    </w:lvl>
+    <w:lvl w:ilvl="7">
+      <w:start w:val="1"/>
+      <w:numFmt w:val="lowerLetter"/>
+      <w:lvlText w:val="%8."/>
+      <w:lvlJc w:val="left"/>
+      <w:pPr>
+        <w:ind w:left="5760" w:hanging="360"/>
+      </w:pPr>
+      <w:rPr>
+        <w:u w:val="none"/>
+      </w:rPr>
+    </w:lvl>
+    <w:lvl w:ilvl="8">
+      <w:start w:val="1"/>
+      <w:numFmt w:val="lowerRoman"/>
+      <w:lvlText w:val="%9."/>
+      <w:lvlJc w:val="right"/>
+      <w:pPr>
+        <w:ind w:left="6480" w:hanging="360"/>
+      </w:pPr>
+      <w:rPr>
+        <w:u w:val="none"/>
+      </w:rPr>
+    </w:lvl>
+  </w:abstractNum>
   <w:num w:numId="1">
     <w:abstractNumId w:val="1"/>
+  </w:num>
+  <w:num w:numId="2">
+    <w:abstractNumId w:val="2"/>
   </w:num>
 </w:numbering>
 </file>

</xml_diff>